<commit_message>
Book 50: regenerate PDF/DOCX after accuracy-review fixes
</commit_message>
<xml_diff>
--- a/fusul-al-ummah/exports/فصول الأمة - شرح أصول السنة.docx
+++ b/fusul-al-ummah/exports/فصول الأمة - شرح أصول السنة.docx
@@ -938,7 +938,7 @@
                 <w:szCs w:val="20"/>
                 <w:rtl/>
               </w:rPr>
-              <w:t xml:space="preserve">ISBN 978-1-7345678-3-5</w:t>
+              <w:t xml:space="preserve">ISBN 978-1-7345678-3-0</w:t>
             </w:r>
           </w:p>
         </w:tc>
@@ -3548,7 +3548,7 @@
           <w:szCs w:val="22"/>
           <w:rtl/>
         </w:rPr>
-        <w:t xml:space="preserve">قال عبد الله بن مسعود رضي الله عنه: "إياكم ومجالسة أصحاب الأهواء، فإنها تورث الريب في القلوب". وقال عمر بن الخطاب رضي الله عنه: "لا تجالسوا أصحاب الأهواء، فإنهم يمرضون القلوب". وهذان الأثران عن كبار الصحابة يبينان أن هذا الأصل ليس اجتهاداً متأخراً، بل هو منهج معروف من عهد الصحابة أنفسهم.</w:t>
+        <w:t xml:space="preserve">ويُروى عن عبد الله بن مسعود رضي الله عنه أنه قال: "إياكم ومجالسة أصحاب الأهواء، فإنها تورث الريب في القلوب"، ويُنقل عن عمر بن الخطاب رضي الله عنه نحو ذلك: "لا تجالسوا أصحاب الأهواء، فإنهم يمرضون القلوب". وهذان الأثران، وإن كانا من الأقوال المشهورة المتداولة في كتب الاعتقاد أكثر من كونهما مرويين بإسناد متصل موثق، إلا أن معناهما يبين أن هذا الأصل ليس اجتهاداً متأخراً، بل هو منهج معروف من عهد الصحابة أنفسهم.</w:t>
       </w:r>
     </w:p>
     <w:tbl>
@@ -3848,7 +3848,7 @@
           <w:szCs w:val="22"/>
           <w:rtl/>
         </w:rPr>
-        <w:t xml:space="preserve">قال النبي ﷺ: «مَنْ تَرَكَ الْمِرَاءَ وَهُوَ مُحِقٌّ بُنِيَ لَهُ بَيْتٌ فِي رَبَضِ الْجَنَّةِ» (رواه أبو داود والترمذي)، ووجه الدلالة أن هذا الحديث يبيّن أن ترك المراء -حتى مع كون الإنسان على حق- من أسباب دخول الجنة، لعظم ما في النفس من مجاهدة في كظم الرغبة في الانتصار للنفس وإظهار الحق بأي ثمن.</w:t>
+        <w:t xml:space="preserve">قال النبي ﷺ: «أَنَا زَعِيمٌ بِبَيْتٍ فِي رَبَضِ الْجَنَّةِ لِمَنْ تَرَكَ الْمِرَاءَ وَإِنْ كَانَ مُحِقًّا، وَبِبَيْتٍ فِي وَسَطِ الْجَنَّةِ لِمَنْ تَرَكَ الْكَذِبَ وَإِنْ كَانَ مَازِحًا، وَبِبَيْتٍ فِي أَعْلَى الْجَنَّةِ لِمَنْ حَسَّنَ خُلُقَهُ» (رواه أبو داود والترمذي)، ووجه الدلالة أن هذا الحديث يبيّن أن ترك المراء -حتى مع كون الإنسان على حق- من أسباب دخول الجنة، لعظم ما في النفس من مجاهدة في كظم الرغبة في الانتصار للنفس وإظهار الحق بأي ثمن؛ وقد قرن النبي ﷺ بهذا الوعد وعدين آخرين: ترك الكذب ولو مازحاً، وحسن الخلق، فدلّ على أن هذه الخصال الثلاث من أعظم ما يُبنى به بيت في الجنة.</w:t>
       </w:r>
     </w:p>
     <w:tbl>
@@ -5368,7 +5368,7 @@
           <w:szCs w:val="22"/>
           <w:rtl/>
         </w:rPr>
-        <w:t xml:space="preserve">ومن السنة حديث ابن عمر رضي الله عنهما الطويل في سؤال جبريل عليه السلام النبي صلى الله عليه وسلم عن الإسلام والإيمان والإحسان، وفيه أن النبي صلى الله عليه وسلم قال: «أَنْ تُؤْمِنَ بِاللَّهِ، وَمَلَائِكَتِهِ، وَكُتُبِهِ، وَرُسُلِهِ، وَالْيَوْمِ الْآخِرِ، وَتُؤْمِنَ بِالْقَدَرِ خَيْرِهِ وَشَرِّهِ» (رواه مسلم)، فجعل النبي صلى الله عليه وسلم الإيمان بالقدر خيره وشره ركناً سادساً من أركان الإيمان، مقروناً بالإيمان بالله وملائكته وكتبه ورسله واليوم الآخر، مما يدل على عظم شأنه ومكانته.</w:t>
+        <w:t xml:space="preserve">ومن السنة حديث عمر بن الخطاب رضي الله عنه الطويل في سؤال جبريل عليه السلام النبي صلى الله عليه وسلم عن الإسلام والإيمان والإحسان، وفيه أن النبي صلى الله عليه وسلم قال: «أَنْ تُؤْمِنَ بِاللَّهِ، وَمَلَائِكَتِهِ، وَكُتُبِهِ، وَرُسُلِهِ، وَالْيَوْمِ الْآخِرِ، وَتُؤْمِنَ بِالْقَدَرِ خَيْرِهِ وَشَرِّهِ» (رواه مسلم)، فجعل النبي صلى الله عليه وسلم الإيمان بالقدر خيره وشره ركناً سادساً من أركان الإيمان، مقروناً بالإيمان بالله وملائكته وكتبه ورسله واليوم الآخر، مما يدل على عظم شأنه ومكانته.</w:t>
       </w:r>
     </w:p>
     <w:tbl>
@@ -8707,7 +8707,49 @@
           <w:szCs w:val="22"/>
           <w:rtl/>
         </w:rPr>
-        <w:t xml:space="preserve">، فقد قرر جمهور سلف الأمة أن "النظر" هنا متعدٍّ بـ"إلى"، وهذا صريح في نظر العين إلى الله تعالى، إذ لا يقال في اللغة العربية "نظر إلى كذا" إلا للنظر بالعين غالباً، بخلاف نظر القلب فإنه يقال فيه "نظر في كذا" أو "فكّر فيه". وهذا هو ما أشار إليه الإمام أحمد بقوله "الزيادة" في الفقرة السابقة على هذا الموضع من التصنيف العام لأصول الاعتقاد.</w:t>
+        <w:t xml:space="preserve">، فقد قرر جمهور سلف الأمة أن "النظر" هنا متعدٍّ بـ"إلى"، وهذا صريح في نظر العين إلى الله تعالى، إذ لا يقال في اللغة العربية "نظر إلى كذا" إلا للنظر بالعين غالباً، بخلاف نظر القلب فإنه يقال فيه "نظر في كذا" أو "فكّر فيه". ويؤيد هذا أيضاً قوله تعالى: </w:t>
+      </w:r>
+      <w:r>
+        <w:rPr>
+          <w:rFonts w:ascii="Amiri Quran" w:cs="Amiri Quran" w:eastAsia="Amiri Quran" w:hAnsi="Amiri Quran"/>
+          <w:b w:val="false"/>
+          <w:bCs w:val="false"/>
+          <w:i w:val="false"/>
+          <w:iCs w:val="false"/>
+          <w:color w:val="0D2143"/>
+          <w:sz w:val="26"/>
+          <w:szCs w:val="26"/>
+          <w:rtl/>
+        </w:rPr>
+        <w:t xml:space="preserve">﴿لِلَّذِينَ أَحْسَنُوا الْحُسْنَى وَزِيَادَةٌ﴾</w:t>
+      </w:r>
+      <w:r>
+        <w:rPr>
+          <w:rFonts w:ascii="Cairo" w:cs="Cairo" w:eastAsia="Cairo" w:hAnsi="Cairo"/>
+          <w:b/>
+          <w:bCs/>
+          <w:i w:val="false"/>
+          <w:iCs w:val="false"/>
+          <w:color w:val="8A6A1F"/>
+          <w:sz w:val="16"/>
+          <w:szCs w:val="16"/>
+          <w:rtl/>
+        </w:rPr>
+        <w:t xml:space="preserve"> [يونس: 26]</w:t>
+      </w:r>
+      <w:r>
+        <w:rPr>
+          <w:rFonts w:ascii="Amiri" w:cs="Amiri" w:eastAsia="Amiri" w:hAnsi="Amiri"/>
+          <w:b w:val="false"/>
+          <w:bCs w:val="false"/>
+          <w:i w:val="false"/>
+          <w:iCs w:val="false"/>
+          <w:color w:val="181410"/>
+          <w:sz w:val="22"/>
+          <w:szCs w:val="22"/>
+          <w:rtl/>
+        </w:rPr>
+        <w:t xml:space="preserve">، وقد فسّر النبي ﷺ "الزيادة" في هذه الآية بأنها النظر إلى وجه الله الكريم، كما ثبت ذلك في صحيح مسلم من حديث صهيب رضي الله عنه.</w:t>
       </w:r>
     </w:p>
     <w:p>
@@ -13177,7 +13219,7 @@
           <w:szCs w:val="22"/>
           <w:rtl/>
         </w:rPr>
-        <w:t xml:space="preserve">استدل الإمام بقوله صلى الله عليه وسلم: «بَيْنَ الرَّجُلِ وَبَيْنَ الْكُفْرِ تَرْكُ الصَّلَاةِ» (رواه مسلم)، ووجه الدلالة أن النبي ﷺ جعل ترك الصلاة حداً فاصلاً بين الرجل والكفر، فمن تركها فقد جاوز ذلك الحد. واستدل أيضاً بقوله صلى الله عليه وسلم: «الْعَهْدُ الَّذِي بَيْنَنَا وَبَيْنَهُمُ الصَّلَاةُ، فَمَنْ تَرَكَهَا فَقَدْ كَفَرَ» (رواه الترمذي)، وهو نص صريح في المسألة.</w:t>
+        <w:t xml:space="preserve">استدل الإمام بقوله صلى الله عليه وسلم: «بَيْنَ الرَّجُلِ وَبَيْنَ الشِّرْكِ وَالْكُفْرِ تَرْكُ الصَّلَاةِ» (رواه مسلم)، ووجه الدلالة أن النبي ﷺ جعل ترك الصلاة حداً فاصلاً بين الرجل والكفر، فمن تركها فقد جاوز ذلك الحد. واستدل أيضاً بقوله صلى الله عليه وسلم: «الْعَهْدُ الَّذِي بَيْنَنَا وَبَيْنَهُمُ الصَّلَاةُ، فَمَنْ تَرَكَهَا فَقَدْ كَفَرَ» (رواه الترمذي)، وهو نص صريح في المسألة.</w:t>
       </w:r>
     </w:p>
     <w:tbl>
@@ -14500,7 +14542,7 @@
           <w:szCs w:val="22"/>
           <w:rtl/>
         </w:rPr>
-        <w:t xml:space="preserve"> اختار عمر رضي الله عنه هؤلاء الستة دون غيرهم لأنهم توفي عنهم النبي صلى الله عليه وسلم وهو راضٍ عنهم، ولأنهم من أهل بدر والسابقة العظيمة في الإسلام، ولم يُدخل نفسه معهم مع أنه أحد العشرة، تواضعًا منه وزهدًا في الإمارة لنفسه أو لأحد من أهل بيته، وهذا من عدله وورعه المعروفين رضي الله عنه.</w:t>
+        <w:t xml:space="preserve"> اختار عمر رضي الله عنه هؤلاء الستة دون غيرهم لأنهم توفي عنهم النبي صلى الله عليه وسلم وهو راضٍ عنهم، ولأن أكثرهم من أهل بدر والسابقة العظيمة في الإسلام؛ وأما طلحة وسعيد بن زيد فقد كانا في مهمة استطلاع بأمر النبي ﷺ يوم بدر فلم يشهدا القتال بأنفسهما، إلا أن النبي ﷺ ألحقهما بأهل بدر وأعطاهما سهمهما وأجرهما، فكانا في حكمهم وإن غابا عن المعركة. ولم يُدخل عمر نفسه معهم مع أنه أحد العشرة، تواضعًا منه وزهدًا في الإمارة لنفسه أو لأحد من أهل بيته، وهذا من عدله وورعه المعروفين رضي الله عنه.</w:t>
       </w:r>
     </w:p>
     <w:tbl>
@@ -15668,7 +15710,7 @@
           <w:szCs w:val="22"/>
           <w:rtl/>
         </w:rPr>
-        <w:t xml:space="preserve">وعن عبد الله بن مسعود رضي الله عنه أن النبي ﷺ قال: «مَنْ كَرِهَ مِنْ أَمِيرِهِ شَيْئًا فَلْيَصْبِرْ، فَإِنَّهُ مَنْ خَرَجَ مِنَ السُّلْطَانِ شِبْرًا مَاتَ مِيتَةً جَاهِلِيَّةً» (رواه البخاري ومسلم)، وهذا نص صريح في وجوب الصبر على الوالي ولو كره المرء منه شيئاً، وتحذير شديد من الخروج عليه أو منازعته سلطانه.</w:t>
+        <w:t xml:space="preserve">وعن عبد الله بن عباس رضي الله عنهما أن النبي ﷺ قال: «مَنْ كَرِهَ مِنْ أَمِيرِهِ شَيْئًا فَلْيَصْبِرْ، فَإِنَّهُ مَنْ خَرَجَ مِنَ السُّلْطَانِ شِبْرًا مَاتَ مِيتَةً جَاهِلِيَّةً» (رواه البخاري ومسلم)، وهذا نص صريح في وجوب الصبر على الوالي ولو كره المرء منه شيئاً، وتحذير شديد من الخروج عليه أو منازعته سلطانه.</w:t>
       </w:r>
     </w:p>
     <w:p>
@@ -18747,7 +18789,7 @@
           <w:szCs w:val="22"/>
           <w:rtl/>
         </w:rPr>
-        <w:t xml:space="preserve">استدل الإمام بقوله صلى الله عليه وسلم: «لَا تَسُبُّوا أَصْحَابِي، فَوَالَّذِي نَفْسِي بِيَدِهِ، لَوْ أَنَّ أَحَدَكُمْ أَنْفَقَ مِثْلَ أُحُدٍ ذَهَبًا مَا بَلَغَ مُدَّ أَحَدِهِمْ وَلَا نَصِيفَهُ» (رواه البخاري ومسلم)، ووجه الدلالة أن النبي ﷺ نهى صريحاً عن سب أصحابه، وبيّن أن فضلهم بصحبتهم إياه لا يبلغه أحد بعدهم مهما أنفق من المال، فكيف بمن يتعرض لأعراضهم بالطعن. واستدل أيضاً بقول علي بن أبي طالب رضي الله عنه، وهو أحد المعنيين مباشرة بالفتن التي وقعت: "خير هذه الأمة بعد نبيها أبو بكر، ثم عمر، ثم عثمان"، وفي هذا دلالة بالغة على أن عليّاً نفسه -مع ما جرى بينه وبين بعض الصحابة من خلاف سياسي- لم يكن في قلبه شيء تجاه من سبقه، بل أقرّ بفضلهم صراحة.</w:t>
+        <w:t xml:space="preserve">استدل الإمام بقوله صلى الله عليه وسلم: «لَا تَسُبُّوا أَصْحَابِي، فَوَالَّذِي نَفْسِي بِيَدِهِ، لَوْ أَنَّ أَحَدَكُمْ أَنْفَقَ مِثْلَ أُحُدٍ ذَهَبًا مَا بَلَغَ مُدَّ أَحَدِهِمْ وَلَا نَصِيفَهُ» (رواه البخاري ومسلم)، ووجه الدلالة أن النبي ﷺ نهى صريحاً عن سب أصحابه، وبيّن أن فضلهم بصحبتهم إياه لا يبلغه أحد بعدهم مهما أنفق من المال، فكيف بمن يتعرض لأعراضهم بالطعن. واستدل أيضاً بشهادة علي بن أبي طالب رضي الله عنه نفسه، وهو أحد المعنيين مباشرة بالفتن التي وقعت، حين سُئل: من خير الناس بعد رسول الله صلى الله عليه وسلم؟ فقال: "أبو بكر"، قيل: ثم من؟ قال: "ثم عمر" (رواه البخاري)، فخشي ابنه محمد بن الحنفية أن يذكر عثمان فسأله: ثم أنت يا أبتِ؟ فقال: "ما أنا إلا رجل من المسلمين". وفي هذا دلالة بالغة على أن عليّاً نفسه -مع ما جرى بينه وبين بعض الصحابة من خلاف سياسي- لم يكن في قلبه شيء تجاه من سبقه، بل أقرّ بفضلهم صراحة، وتواضع عن تفضيل نفسه. ويؤيده حديث ابن عمر رضي الله عنهما: "كنا نقول والنبي صلى الله عليه وسلم حي: أفضل هذه الأمة بعد نبيها أبو بكر، ثم عمر، ثم عثمان" (رواه البخاري)، وهو الأصل في ترتيب الثلاثة، وقد سبق ذكره في الفقرة السادسة والعشرين.</w:t>
       </w:r>
     </w:p>
     <w:p>
@@ -19563,7 +19605,7 @@
           <w:szCs w:val="22"/>
           <w:rtl/>
         </w:rPr>
-        <w:t xml:space="preserve">، ووجه الدلالة أن لفظ "أُعِدَّت" فعل ماضٍ يدل على وقوع الإعداد والخلق فعلاً، لا أنه أمر مستقبل. واستدل بقوله صلى الله عليه وسلم: «دَخَلْتُ الْجَنَّةَ فَرَأَيْتُ قَصْرًا» (رواه البخاري ومسلم)، وهو من أحاديث رؤيته صلى الله عليه وسلم للجنة ليلة الإسراء، وهذا لا يستقيم إلا إن كانت الجنة مخلوقة موجودة حينئذ.</w:t>
+        <w:t xml:space="preserve">، ووجه الدلالة أن لفظ "أُعِدَّت" فعل ماضٍ يدل على وقوع الإعداد والخلق فعلاً، لا أنه أمر مستقبل. واستدل بقوله صلى الله عليه وسلم: «دَخَلْتُ الْجَنَّةَ فَرَأَيْتُ قَصْرًا» (رواه البخاري ومسلم)، وهي رؤيا رآها النبي ﷺ لقصر عمر بن الخطاب رضي الله عنه في الجنة، وكذلك ما جاء من رؤيته ﷺ للكوثر ليلة الإسراء والمعراج، واطلاعه على الجنة والنار في مواضع أخرى؛ فهذه المشاهد -على تعدد مناسباتها- لا تستقيم إلا إن كانت الجنة والنار مخلوقتين موجودتين حين وقوعها.</w:t>
       </w:r>
     </w:p>
     <w:tbl>
@@ -20272,7 +20314,7 @@
           <w:szCs w:val="22"/>
           <w:rtl/>
         </w:rPr>
-        <w:t xml:space="preserve"> أن هذه الرسالة كُتبت في زمن اشتدت فيه المحنة على أهل السنة، محنة خلق القرآن، فجاءت شاهدة على ثبات الإمام أحمد رحمه الله على الحق، وشاهدة في الوقت نفسه على منهجه العلمي في تقرير هذه المسائل بالدليل لا بالتقليد.</w:t>
+        <w:t xml:space="preserve"> أن هذه الرسالة جاءت -على ما يُذكر في بعض أقوال أهل السير في تأريخها- قريبة من زمن محنة خلق القرآن التي عاناها أهل السنة، وإن كان تحديد تاريخها على وجه القطع مما لا يتسع له هذا المختصر، فهي على كل حال شاهدة على ثبات الإمام أحمد رحمه الله على الحق في هذه المسألة وغيرها، وشاهدة في الوقت نفسه على منهجه العلمي في تقرير مسائل الاعتقاد بالدليل لا بالتقليد.</w:t>
       </w:r>
     </w:p>
     <w:p>
@@ -20649,6 +20691,46 @@
           <w:rtl/>
         </w:rPr>
         <w:t xml:space="preserve"> — للإمام محمد بن يزيد ابن ماجه القزويني رحمه الله.</w:t>
+      </w:r>
+    </w:p>
+    <w:p>
+      <w:pPr>
+        <w:pStyle w:val="ListParagraph"/>
+        <w:numPr>
+          <w:ilvl w:val="0"/>
+          <w:numId w:val="2"/>
+        </w:numPr>
+        <w:bidi/>
+        <w:spacing w:after="90" w:line="300"/>
+        <w:jc w:val="both"/>
+      </w:pPr>
+      <w:r>
+        <w:rPr>
+          <w:rFonts w:ascii="Amiri" w:cs="Amiri" w:eastAsia="Amiri" w:hAnsi="Amiri"/>
+          <w:b w:val="false"/>
+          <w:bCs w:val="false"/>
+          <w:i/>
+          <w:iCs/>
+          <w:color w:val="181410"/>
+          <w:sz w:val="22"/>
+          <w:szCs w:val="22"/>
+          <w:rtl/>
+        </w:rPr>
+        <w:t xml:space="preserve">سنن النسائي</w:t>
+      </w:r>
+      <w:r>
+        <w:rPr>
+          <w:rFonts w:ascii="Amiri" w:cs="Amiri" w:eastAsia="Amiri" w:hAnsi="Amiri"/>
+          <w:b w:val="false"/>
+          <w:bCs w:val="false"/>
+          <w:i w:val="false"/>
+          <w:iCs w:val="false"/>
+          <w:color w:val="181410"/>
+          <w:sz w:val="22"/>
+          <w:szCs w:val="22"/>
+          <w:rtl/>
+        </w:rPr>
+        <w:t xml:space="preserve"> — للإمام أحمد بن شعيب النسائي رحمه الله.</w:t>
       </w:r>
     </w:p>
     <w:p>
@@ -20995,7 +21077,7 @@
           <w:szCs w:val="20"/>
           <w:rtl/>
         </w:rPr>
-        <w:t xml:space="preserve">فصول الأمة — شرح أصول السنة للإمام أحمد بن حنبل رضي الله عنهشرحٌ لأصول السنة، الفقرة الثامنة والثلاثين من مقدمتها إلى خاتمتها، بقلم راجي عفو ربه الغفور أحمد بن إبراهيم السليمي.جامعة الملك العالمية — Al-Mulk International University</w:t>
+        <w:t xml:space="preserve">فصول الأمة — شرح أصول السنة للإمام أحمد بن حنبل رضي الله عنهشرحٌ لأصول السنة بفقراتها الثمان والثلاثين، من مقدمتها إلى خاتمتها، بقلم راجي عفو ربه الغفور أحمد بن إبراهيم السليمي.جامعة الملك العالمية — Al-Mulk International University</w:t>
       </w:r>
     </w:p>
     <w:p>
@@ -21254,7 +21336,7 @@
           <w:szCs w:val="16"/>
           <w:rtl/>
         </w:rPr>
-        <w:t xml:space="preserve">ISBN 978-1-7345678-3-5</w:t>
+        <w:t xml:space="preserve">ISBN 978-1-7345678-3-0</w:t>
       </w:r>
     </w:p>
     <w:p>

</xml_diff>

<commit_message>
Book 50: regenerate PDF (117pp)/DOCX with new indices and methodology section
</commit_message>
<xml_diff>
--- a/fusul-al-ummah/exports/فصول الأمة - شرح أصول السنة.docx
+++ b/fusul-al-ummah/exports/فصول الأمة - شرح أصول السنة.docx
@@ -1161,7 +1161,7 @@
           <w:szCs w:val="32"/>
           <w:rtl/>
         </w:rPr>
-        <w:t xml:space="preserve">تقريظات وتوصيات علمية</w:t>
+        <w:t xml:space="preserve">عرض الكتاب على أهل العلم</w:t>
       </w:r>
       <w:bookmarkEnd w:id="1001"/>
     </w:p>
@@ -1184,7 +1184,7 @@
           <w:rtl/>
         </w:rPr>
         <w:t xml:space="preserve">
-      مكان مخصص لتقريظات العلماء والمؤسسات العلمية والدور الإفتائية التي تراجع الكتاب وتوصي به. تُضاف هذه التقريظات بنصوصها الرسمية وتوقيعات أصحابها عند توفرها من الجهات المعنية، حفاظاً على دقة النسبة العلمية.
+      هذه الطبعة معروضة للمراجعة العلمية من قبل أهل العلم وطلبته، رجاء الاستفادة من ملاحظاتهم وتوجيهاتهم قبل الاستقرار على صورتها النهائية. وسيُلحق بهذا الموضع، عند توفرها، ما يتفضل به المراجعون من ملاحظات علمية موثقة بنصوصها وتوقيعات أصحابها.
     </w:t>
       </w:r>
     </w:p>
@@ -1358,7 +1358,7 @@
                 <w:szCs w:val="20"/>
                 <w:rtl/>
               </w:rPr>
-              <w:t xml:space="preserve">راجي عفو ربه الغفور أحمد بن إبراهيم السليمي — تُستكمل السيرة العلمية والمسار الإسنادي من المؤلف</w:t>
+              <w:t xml:space="preserve">راجي عفو ربه الغفور أحمد بن إبراهيم السليمي</w:t>
             </w:r>
           </w:p>
         </w:tc>
@@ -1472,10 +1472,10 @@
         <w:pStyle w:val="Heading1"/>
         <w:pageBreakBefore/>
         <w:bidi/>
-        <w:spacing w:after="160" w:before="0"/>
+        <w:spacing w:after="200" w:before="0"/>
         <w:jc w:val="right"/>
       </w:pPr>
-      <w:bookmarkStart w:name="bm_native_toc" w:id="1004"/>
+      <w:bookmarkStart w:name="bm_manhaj" w:id="1004"/>
       <w:r>
         <w:rPr>
           <w:rFonts w:ascii="Aref Ruqaa" w:cs="Aref Ruqaa" w:eastAsia="Aref Ruqaa" w:hAnsi="Aref Ruqaa"/>
@@ -1488,9 +1488,57 @@
           <w:szCs w:val="32"/>
           <w:rtl/>
         </w:rPr>
+        <w:t xml:space="preserve">منهج التحقيق في هذه الطبعة</w:t>
+      </w:r>
+      <w:bookmarkEnd w:id="1004"/>
+    </w:p>
+    <w:p>
+      <w:pPr>
+        <w:bidi/>
+        <w:spacing w:after="140" w:before="0" w:line="300"/>
+        <w:jc w:val="both"/>
+      </w:pPr>
+      <w:r>
+        <w:rPr>
+          <w:rFonts w:ascii="Amiri" w:cs="Amiri" w:eastAsia="Amiri" w:hAnsi="Amiri"/>
+          <w:b w:val="false"/>
+          <w:bCs w:val="false"/>
+          <w:i w:val="false"/>
+          <w:iCs w:val="false"/>
+          <w:color w:val="181410"/>
+          <w:sz w:val="22"/>
+          <w:szCs w:val="22"/>
+          <w:rtl/>
+        </w:rPr>
+        <w:t xml:space="preserve">
+      اتُّبع في تخريج الأحاديث والآثار الواردة في هذا الشرح المنهج التالي: أُثبتت الأحاديث المتفق على صحتها كما وردت، منسوبة إلى مظانّها في الصحيحين أو السنن. وحيثما وقع خلاف بين أهل الحديث في تصحيح حديث أو أثر أو في تحديد راويه، أو حيثما اشتهرت نسبة قول إلى عالم دون سند متصل موثق، نُبِّه على ذلك صراحةً في موضعه بعبارة "تنبيه"، دون التستر على الخلاف أو الجزم بما لم يثبت. وإذا كان أصل الحديث محل كلام عند النقاد، وكان معناه ثابتاً بأدلة أخرى قطعية، أُشير إلى تلك الأدلة معه لئلا يُبنى الحكم على النص المختلف فيه وحده. وقد بُذل الجهد في تحرير هذه المواضع، مع الإقرار بأن كمال الاستقصاء في هذا الباب لا يبلغه إلا أهل الاختصاص من المحدثين، ولذلك تُعرض هذه الطبعة على أهل العلم رجاء تقويم ما فات هذا الجهد المقل من نظر أو تحرير.
+    </w:t>
+      </w:r>
+    </w:p>
+    <w:p>
+      <w:pPr>
+        <w:pStyle w:val="Heading1"/>
+        <w:pageBreakBefore/>
+        <w:bidi/>
+        <w:spacing w:after="160" w:before="0"/>
+        <w:jc w:val="right"/>
+      </w:pPr>
+      <w:bookmarkStart w:name="bm_native_toc" w:id="1005"/>
+      <w:r>
+        <w:rPr>
+          <w:rFonts w:ascii="Aref Ruqaa" w:cs="Aref Ruqaa" w:eastAsia="Aref Ruqaa" w:hAnsi="Aref Ruqaa"/>
+          <w:b/>
+          <w:bCs/>
+          <w:i w:val="false"/>
+          <w:iCs w:val="false"/>
+          <w:color w:val="0D2143"/>
+          <w:sz w:val="32"/>
+          <w:szCs w:val="32"/>
+          <w:rtl/>
+        </w:rPr>
         <w:t xml:space="preserve">فهرس المحتويات</w:t>
       </w:r>
-      <w:bookmarkEnd w:id="1004"/>
+      <w:bookmarkEnd w:id="1005"/>
     </w:p>
     <w:p>
       <w:pPr>
@@ -1545,7 +1593,7 @@
         <w:spacing w:after="200" w:before="0"/>
         <w:jc w:val="right"/>
       </w:pPr>
-      <w:bookmarkStart w:name="bm_muqaddimah" w:id="1005"/>
+      <w:bookmarkStart w:name="bm_muqaddimah" w:id="1006"/>
       <w:r>
         <w:rPr>
           <w:rFonts w:ascii="Aref Ruqaa" w:cs="Aref Ruqaa" w:eastAsia="Aref Ruqaa" w:hAnsi="Aref Ruqaa"/>
@@ -1560,7 +1608,7 @@
         </w:rPr>
         <w:t xml:space="preserve">مقدمة الشارح</w:t>
       </w:r>
-      <w:bookmarkEnd w:id="1005"/>
+      <w:bookmarkEnd w:id="1006"/>
     </w:p>
     <w:p>
       <w:pPr>
@@ -1767,7 +1815,7 @@
         <w:spacing w:after="160" w:before="0"/>
         <w:jc w:val="right"/>
       </w:pPr>
-      <w:bookmarkStart w:name="bm_bab1" w:id="1006"/>
+      <w:bookmarkStart w:name="bm_bab1" w:id="1007"/>
       <w:r>
         <w:rPr>
           <w:rFonts w:ascii="Aref Ruqaa" w:cs="Aref Ruqaa" w:eastAsia="Aref Ruqaa" w:hAnsi="Aref Ruqaa"/>
@@ -1782,7 +1830,7 @@
         </w:rPr>
         <w:t xml:space="preserve">الباب الأول — في التمسك بالسنة ومنهج أهل السنة في التلقي والاتباع</w:t>
       </w:r>
-      <w:bookmarkEnd w:id="1006"/>
+      <w:bookmarkEnd w:id="1007"/>
     </w:p>
     <w:p>
       <w:pPr>
@@ -1791,7 +1839,7 @@
         <w:spacing w:after="140" w:before="320"/>
         <w:jc w:val="right"/>
       </w:pPr>
-      <w:bookmarkStart w:name="bm_faqrah_1" w:id="1007"/>
+      <w:bookmarkStart w:name="bm_faqrah_1" w:id="1008"/>
       <w:r>
         <w:rPr>
           <w:rFonts w:ascii="Aref Ruqaa" w:cs="Aref Ruqaa" w:eastAsia="Aref Ruqaa" w:hAnsi="Aref Ruqaa"/>
@@ -1806,7 +1854,7 @@
         </w:rPr>
         <w:t xml:space="preserve">الفقرة الأولى: التمسك بهدي الصحابة والاقتداء بهم</w:t>
       </w:r>
-      <w:bookmarkEnd w:id="1007"/>
+      <w:bookmarkEnd w:id="1008"/>
     </w:p>
     <w:p>
       <w:pPr>
@@ -2225,7 +2273,7 @@
         <w:spacing w:after="140" w:before="320"/>
         <w:jc w:val="right"/>
       </w:pPr>
-      <w:bookmarkStart w:name="bm_faqrah_2" w:id="1008"/>
+      <w:bookmarkStart w:name="bm_faqrah_2" w:id="1009"/>
       <w:r>
         <w:rPr>
           <w:rFonts w:ascii="Aref Ruqaa" w:cs="Aref Ruqaa" w:eastAsia="Aref Ruqaa" w:hAnsi="Aref Ruqaa"/>
@@ -2240,7 +2288,7 @@
         </w:rPr>
         <w:t xml:space="preserve">الفقرة الثانية: ترك البدع</w:t>
       </w:r>
-      <w:bookmarkEnd w:id="1008"/>
+      <w:bookmarkEnd w:id="1009"/>
     </w:p>
     <w:p>
       <w:pPr>
@@ -2664,7 +2712,7 @@
         <w:spacing w:after="140" w:before="320"/>
         <w:jc w:val="right"/>
       </w:pPr>
-      <w:bookmarkStart w:name="bm_faqrah_3" w:id="1009"/>
+      <w:bookmarkStart w:name="bm_faqrah_3" w:id="1010"/>
       <w:r>
         <w:rPr>
           <w:rFonts w:ascii="Aref Ruqaa" w:cs="Aref Ruqaa" w:eastAsia="Aref Ruqaa" w:hAnsi="Aref Ruqaa"/>
@@ -2679,7 +2727,7 @@
         </w:rPr>
         <w:t xml:space="preserve">الفقرة الثالثة: ترك الخصومات في الدين</w:t>
       </w:r>
-      <w:bookmarkEnd w:id="1009"/>
+      <w:bookmarkEnd w:id="1010"/>
     </w:p>
     <w:p>
       <w:pPr>
@@ -3145,7 +3193,7 @@
         <w:spacing w:after="140" w:before="320"/>
         <w:jc w:val="right"/>
       </w:pPr>
-      <w:bookmarkStart w:name="bm_faqrah_4" w:id="1010"/>
+      <w:bookmarkStart w:name="bm_faqrah_4" w:id="1011"/>
       <w:r>
         <w:rPr>
           <w:rFonts w:ascii="Aref Ruqaa" w:cs="Aref Ruqaa" w:eastAsia="Aref Ruqaa" w:hAnsi="Aref Ruqaa"/>
@@ -3160,7 +3208,7 @@
         </w:rPr>
         <w:t xml:space="preserve">الفقرة الرابعة: ترك مجالسة أهل الأهواء</w:t>
       </w:r>
-      <w:bookmarkEnd w:id="1010"/>
+      <w:bookmarkEnd w:id="1011"/>
     </w:p>
     <w:p>
       <w:pPr>
@@ -3634,7 +3682,7 @@
         <w:spacing w:after="140" w:before="320"/>
         <w:jc w:val="right"/>
       </w:pPr>
-      <w:bookmarkStart w:name="bm_faqrah_5" w:id="1011"/>
+      <w:bookmarkStart w:name="bm_faqrah_5" w:id="1012"/>
       <w:r>
         <w:rPr>
           <w:rFonts w:ascii="Aref Ruqaa" w:cs="Aref Ruqaa" w:eastAsia="Aref Ruqaa" w:hAnsi="Aref Ruqaa"/>
@@ -3649,7 +3697,7 @@
         </w:rPr>
         <w:t xml:space="preserve">الفقرة الخامسة: ترك المراء والجدال</w:t>
       </w:r>
-      <w:bookmarkEnd w:id="1011"/>
+      <w:bookmarkEnd w:id="1012"/>
     </w:p>
     <w:p>
       <w:pPr>
@@ -4073,7 +4121,7 @@
         <w:spacing w:after="140" w:before="320"/>
         <w:jc w:val="right"/>
       </w:pPr>
-      <w:bookmarkStart w:name="bm_faqrah_6" w:id="1012"/>
+      <w:bookmarkStart w:name="bm_faqrah_6" w:id="1013"/>
       <w:r>
         <w:rPr>
           <w:rFonts w:ascii="Aref Ruqaa" w:cs="Aref Ruqaa" w:eastAsia="Aref Ruqaa" w:hAnsi="Aref Ruqaa"/>
@@ -4088,7 +4136,7 @@
         </w:rPr>
         <w:t xml:space="preserve">الفقرة السادسة: مكانة السنة ووظيفتها في تفسير القرآن</w:t>
       </w:r>
-      <w:bookmarkEnd w:id="1012"/>
+      <w:bookmarkEnd w:id="1013"/>
     </w:p>
     <w:p>
       <w:pPr>
@@ -4521,7 +4569,7 @@
         <w:spacing w:after="140" w:before="320"/>
         <w:jc w:val="right"/>
       </w:pPr>
-      <w:bookmarkStart w:name="bm_faqrah_7" w:id="1013"/>
+      <w:bookmarkStart w:name="bm_faqrah_7" w:id="1014"/>
       <w:r>
         <w:rPr>
           <w:rFonts w:ascii="Aref Ruqaa" w:cs="Aref Ruqaa" w:eastAsia="Aref Ruqaa" w:hAnsi="Aref Ruqaa"/>
@@ -4536,7 +4584,7 @@
         </w:rPr>
         <w:t xml:space="preserve">الفقرة السابعة: عدم إخضاع السنة للقياس والعقل والهوى</w:t>
       </w:r>
-      <w:bookmarkEnd w:id="1013"/>
+      <w:bookmarkEnd w:id="1014"/>
     </w:p>
     <w:p>
       <w:pPr>
@@ -4892,7 +4940,7 @@
         <w:spacing w:after="160" w:before="0"/>
         <w:jc w:val="right"/>
       </w:pPr>
-      <w:bookmarkStart w:name="bm_bab2" w:id="1014"/>
+      <w:bookmarkStart w:name="bm_bab2" w:id="1015"/>
       <w:r>
         <w:rPr>
           <w:rFonts w:ascii="Aref Ruqaa" w:cs="Aref Ruqaa" w:eastAsia="Aref Ruqaa" w:hAnsi="Aref Ruqaa"/>
@@ -4907,7 +4955,7 @@
         </w:rPr>
         <w:t xml:space="preserve">الباب الثاني — في الإيمان بالقدر والتسليم لنصوص الغيب</w:t>
       </w:r>
-      <w:bookmarkEnd w:id="1014"/>
+      <w:bookmarkEnd w:id="1015"/>
     </w:p>
     <w:p>
       <w:pPr>
@@ -4916,7 +4964,7 @@
         <w:spacing w:after="140" w:before="320"/>
         <w:jc w:val="right"/>
       </w:pPr>
-      <w:bookmarkStart w:name="bm_faqrah_8" w:id="1015"/>
+      <w:bookmarkStart w:name="bm_faqrah_8" w:id="1016"/>
       <w:r>
         <w:rPr>
           <w:rFonts w:ascii="Aref Ruqaa" w:cs="Aref Ruqaa" w:eastAsia="Aref Ruqaa" w:hAnsi="Aref Ruqaa"/>
@@ -4931,7 +4979,7 @@
         </w:rPr>
         <w:t xml:space="preserve">الفقرة الثامنة: الإيمان بالقدر خيره وشره</w:t>
       </w:r>
-      <w:bookmarkEnd w:id="1015"/>
+      <w:bookmarkEnd w:id="1016"/>
     </w:p>
     <w:p>
       <w:pPr>
@@ -5593,7 +5641,7 @@
         <w:spacing w:after="140" w:before="320"/>
         <w:jc w:val="right"/>
       </w:pPr>
-      <w:bookmarkStart w:name="bm_faqrah_9" w:id="1016"/>
+      <w:bookmarkStart w:name="bm_faqrah_9" w:id="1017"/>
       <w:r>
         <w:rPr>
           <w:rFonts w:ascii="Aref Ruqaa" w:cs="Aref Ruqaa" w:eastAsia="Aref Ruqaa" w:hAnsi="Aref Ruqaa"/>
@@ -5608,7 +5656,7 @@
         </w:rPr>
         <w:t xml:space="preserve">الفقرة التاسعة: التصديق بأحاديث القدر دون سؤال «لِمَ» و«كيف»</w:t>
       </w:r>
-      <w:bookmarkEnd w:id="1016"/>
+      <w:bookmarkEnd w:id="1017"/>
     </w:p>
     <w:p>
       <w:pPr>
@@ -6005,7 +6053,7 @@
         <w:spacing w:after="140" w:before="320"/>
         <w:jc w:val="right"/>
       </w:pPr>
-      <w:bookmarkStart w:name="bm_faqrah_10" w:id="1017"/>
+      <w:bookmarkStart w:name="bm_faqrah_10" w:id="1018"/>
       <w:r>
         <w:rPr>
           <w:rFonts w:ascii="Aref Ruqaa" w:cs="Aref Ruqaa" w:eastAsia="Aref Ruqaa" w:hAnsi="Aref Ruqaa"/>
@@ -6020,7 +6068,7 @@
         </w:rPr>
         <w:t xml:space="preserve">الفقرة العاشرة: التسليم لما يُعجز العقل عن إدراكه</w:t>
       </w:r>
-      <w:bookmarkEnd w:id="1017"/>
+      <w:bookmarkEnd w:id="1018"/>
     </w:p>
     <w:p>
       <w:pPr>
@@ -6389,7 +6437,7 @@
         <w:spacing w:after="140" w:before="320"/>
         <w:jc w:val="right"/>
       </w:pPr>
-      <w:bookmarkStart w:name="bm_faqrah_11" w:id="1018"/>
+      <w:bookmarkStart w:name="bm_faqrah_11" w:id="1019"/>
       <w:r>
         <w:rPr>
           <w:rFonts w:ascii="Aref Ruqaa" w:cs="Aref Ruqaa" w:eastAsia="Aref Ruqaa" w:hAnsi="Aref Ruqaa"/>
@@ -6404,7 +6452,7 @@
         </w:rPr>
         <w:t xml:space="preserve">الفقرة الحادية عشرة: الإيمان بأحاديث الرؤية</w:t>
       </w:r>
-      <w:bookmarkEnd w:id="1018"/>
+      <w:bookmarkEnd w:id="1019"/>
     </w:p>
     <w:p>
       <w:pPr>
@@ -6822,7 +6870,7 @@
         <w:spacing w:after="140" w:before="320"/>
         <w:jc w:val="right"/>
       </w:pPr>
-      <w:bookmarkStart w:name="bm_faqrah_12" w:id="1019"/>
+      <w:bookmarkStart w:name="bm_faqrah_12" w:id="1020"/>
       <w:r>
         <w:rPr>
           <w:rFonts w:ascii="Aref Ruqaa" w:cs="Aref Ruqaa" w:eastAsia="Aref Ruqaa" w:hAnsi="Aref Ruqaa"/>
@@ -6837,7 +6885,7 @@
         </w:rPr>
         <w:t xml:space="preserve">الفقرة الثانية عشرة: النهي عن الجدال في القدر والرؤية والقرآن</w:t>
       </w:r>
-      <w:bookmarkEnd w:id="1019"/>
+      <w:bookmarkEnd w:id="1020"/>
     </w:p>
     <w:p>
       <w:pPr>
@@ -7138,7 +7186,7 @@
         <w:spacing w:after="160" w:before="0"/>
         <w:jc w:val="right"/>
       </w:pPr>
-      <w:bookmarkStart w:name="bm_bab3" w:id="1020"/>
+      <w:bookmarkStart w:name="bm_bab3" w:id="1021"/>
       <w:r>
         <w:rPr>
           <w:rFonts w:ascii="Aref Ruqaa" w:cs="Aref Ruqaa" w:eastAsia="Aref Ruqaa" w:hAnsi="Aref Ruqaa"/>
@@ -7153,7 +7201,7 @@
         </w:rPr>
         <w:t xml:space="preserve">الباب الثالث — في القرآن كلام الله غير مخلوق</w:t>
       </w:r>
-      <w:bookmarkEnd w:id="1020"/>
+      <w:bookmarkEnd w:id="1021"/>
     </w:p>
     <w:p>
       <w:pPr>
@@ -7162,7 +7210,7 @@
         <w:spacing w:after="140" w:before="320"/>
         <w:jc w:val="right"/>
       </w:pPr>
-      <w:bookmarkStart w:name="bm_faqrah_13" w:id="1021"/>
+      <w:bookmarkStart w:name="bm_faqrah_13" w:id="1022"/>
       <w:r>
         <w:rPr>
           <w:rFonts w:ascii="Aref Ruqaa" w:cs="Aref Ruqaa" w:eastAsia="Aref Ruqaa" w:hAnsi="Aref Ruqaa"/>
@@ -7177,7 +7225,7 @@
         </w:rPr>
         <w:t xml:space="preserve">الفقرة الثالثة عشرة: القرآن كلام الله غير مخلوق</w:t>
       </w:r>
-      <w:bookmarkEnd w:id="1021"/>
+      <w:bookmarkEnd w:id="1022"/>
     </w:p>
     <w:p>
       <w:pPr>
@@ -7923,7 +7971,7 @@
         <w:spacing w:after="140" w:before="320"/>
         <w:jc w:val="right"/>
       </w:pPr>
-      <w:bookmarkStart w:name="bm_faqrah_14" w:id="1022"/>
+      <w:bookmarkStart w:name="bm_faqrah_14" w:id="1023"/>
       <w:r>
         <w:rPr>
           <w:rFonts w:ascii="Aref Ruqaa" w:cs="Aref Ruqaa" w:eastAsia="Aref Ruqaa" w:hAnsi="Aref Ruqaa"/>
@@ -7938,7 +7986,7 @@
         </w:rPr>
         <w:t xml:space="preserve">الفقرة الرابعة عشرة: التحذير من مناظرة أهل البدع في مسألة القرآن</w:t>
       </w:r>
-      <w:bookmarkEnd w:id="1022"/>
+      <w:bookmarkEnd w:id="1023"/>
     </w:p>
     <w:p>
       <w:pPr>
@@ -8475,7 +8523,7 @@
         <w:spacing w:after="160" w:before="0"/>
         <w:jc w:val="right"/>
       </w:pPr>
-      <w:bookmarkStart w:name="bm_bab4" w:id="1023"/>
+      <w:bookmarkStart w:name="bm_bab4" w:id="1024"/>
       <w:r>
         <w:rPr>
           <w:rFonts w:ascii="Aref Ruqaa" w:cs="Aref Ruqaa" w:eastAsia="Aref Ruqaa" w:hAnsi="Aref Ruqaa"/>
@@ -8490,7 +8538,7 @@
         </w:rPr>
         <w:t xml:space="preserve">الباب الرابع — في اليوم الآخر وعالم الغيب</w:t>
       </w:r>
-      <w:bookmarkEnd w:id="1023"/>
+      <w:bookmarkEnd w:id="1024"/>
     </w:p>
     <w:p>
       <w:pPr>
@@ -8499,7 +8547,7 @@
         <w:spacing w:after="140" w:before="320"/>
         <w:jc w:val="right"/>
       </w:pPr>
-      <w:bookmarkStart w:name="bm_faqrah_15" w:id="1024"/>
+      <w:bookmarkStart w:name="bm_faqrah_15" w:id="1025"/>
       <w:r>
         <w:rPr>
           <w:rFonts w:ascii="Aref Ruqaa" w:cs="Aref Ruqaa" w:eastAsia="Aref Ruqaa" w:hAnsi="Aref Ruqaa"/>
@@ -8514,7 +8562,7 @@
         </w:rPr>
         <w:t xml:space="preserve">الفقرة الخامسة عشرة: الإيمان بالرؤية يوم القيامة</w:t>
       </w:r>
-      <w:bookmarkEnd w:id="1024"/>
+      <w:bookmarkEnd w:id="1025"/>
     </w:p>
     <w:p>
       <w:pPr>
@@ -9057,7 +9105,7 @@
         <w:spacing w:after="140" w:before="320"/>
         <w:jc w:val="right"/>
       </w:pPr>
-      <w:bookmarkStart w:name="bm_faqrah_16" w:id="1025"/>
+      <w:bookmarkStart w:name="bm_faqrah_16" w:id="1026"/>
       <w:r>
         <w:rPr>
           <w:rFonts w:ascii="Aref Ruqaa" w:cs="Aref Ruqaa" w:eastAsia="Aref Ruqaa" w:hAnsi="Aref Ruqaa"/>
@@ -9072,7 +9120,7 @@
         </w:rPr>
         <w:t xml:space="preserve">الفقرة السادسة عشرة: رؤية النبي ﷺ لربه</w:t>
       </w:r>
-      <w:bookmarkEnd w:id="1025"/>
+      <w:bookmarkEnd w:id="1026"/>
     </w:p>
     <w:p>
       <w:pPr>
@@ -9202,7 +9250,7 @@
           <w:szCs w:val="22"/>
           <w:rtl/>
         </w:rPr>
-        <w:t xml:space="preserve">روي عن ابن عباس رضي الله عنهما من طرق متعددة أن النبي ﷺ قال: «رَأَيْتُ رَبِّي عَزَّ وَجَلَّ»، وهذا مما رُوي في هذا الباب. وقد اعتنى أهل الحديث ببيان طرق هذا الأثر وأسانيده عن ابن عباس، وهي الأسانيد الثلاثة التي ذكرها الإمام أحمد في هذه الفقرة (طريق قتادة، وطريق الحكم بن أبان، وطريق علي بن زيد بن جدعان)، وقد تكلم أهل العلم في بعض رجال هذه الأسانيد، فمن أراد التحقيق في درجة كل إسناد على حدة فليرجع إلى كتب التخريج المتخصصة وأقوال أئمة الحديث في نقدها، فإن هذا الباب من أدق أبواب العلم وأحوجها إلى التثبت.</w:t>
+        <w:t xml:space="preserve">روي عن ابن عباس رضي الله عنهما من طرق متعددة أن النبي ﷺ قال: «رَأَيْتُ رَبِّي عَزَّ وَجَلَّ»، وهذا مما رُوي في هذا الباب. وقد اعتنى أهل الحديث ببيان طرق هذا الأثر وأسانيده عن ابن عباس، وهي الأسانيد الثلاثة التي ذكرها الإمام أحمد في هذه الفقرة (طريق قتادة، وطريق الحكم بن أبان، وطريق علي بن زيد بن جدعان)، وقد تكلم أهل العلم في بعض رجال هذه الأسانيد، فمن أراد التحقيق في درجة كل إسناد على حدة فليرجع إلى كتب التخريج المتخصصة وأقوال أئمة الحديث في نقدها، فإن هذا الباب من أدق أبواب العلم وأحوجها إلى التثبت. وينبغي التنبيه إلى أن هذه الطرق نفسها قد رُويت في بعض المصادر بألفاظ أكثر تفصيلاً مما اقتصر عليه هذا المختصر، وهي ألفاظ وقع فيها خلاف شديد بين أئمة الحديث والنقد، فرفضها جماعة منهم كابن الجوزي والذهبي رحمهما الله، بينما قبل بعض المحدثين رواية مقيدة بأنها رؤيا منامية لا رؤية يقظة؛ ولذلك اقتصر هذا الشرح على أصل المسألة (هل رأى النبي ﷺ ربه أم لا) دون الخوض في تلك الألفاظ المختلف فيها اختلافاً شديداً، تحرياً للسلامة العلمية.</w:t>
       </w:r>
     </w:p>
     <w:p>
@@ -9511,7 +9559,7 @@
         <w:spacing w:after="140" w:before="320"/>
         <w:jc w:val="right"/>
       </w:pPr>
-      <w:bookmarkStart w:name="bm_faqrah_17" w:id="1026"/>
+      <w:bookmarkStart w:name="bm_faqrah_17" w:id="1027"/>
       <w:r>
         <w:rPr>
           <w:rFonts w:ascii="Aref Ruqaa" w:cs="Aref Ruqaa" w:eastAsia="Aref Ruqaa" w:hAnsi="Aref Ruqaa"/>
@@ -9526,7 +9574,7 @@
         </w:rPr>
         <w:t xml:space="preserve">الفقرة السابعة عشرة: منهج أهل السنة في التعامل مع نصوص الصفات</w:t>
       </w:r>
-      <w:bookmarkEnd w:id="1026"/>
+      <w:bookmarkEnd w:id="1027"/>
     </w:p>
     <w:p>
       <w:pPr>
@@ -9767,7 +9815,7 @@
           <w:szCs w:val="22"/>
           <w:rtl/>
         </w:rPr>
-        <w:t xml:space="preserve">وقد نقل عن الإمام أحمد رحمه الله نفسه -صاحب هذا المتن- في تقرير هذا المنهج قوله في أحاديث الصفات: "نمرّها كما جاءت، ونؤمن بها، ولا نقول: كيف؟ ولا: لِمَ؟"، وهذا هو عين ما قرره في هذه الفقرة، وهو امتداد لما تقدم في الفقرة العاشرة من هذا المتن، حيث ذكر أن من لم يعرف تفسير الحديث ويعيا عنه عقله، فعليه الإيمان به والتسليم له.</w:t>
+        <w:t xml:space="preserve">وهذا المعنى هو ما اشتهر عن أئمة السلف في التعامل مع نصوص الصفات عموماً، ومنه القول المشهور المنقول عن جمع منهم -كالأوزاعي ومالك والليث بن سعد وسفيان الثوري، كما رواه الترمذي عنهم-: "أمِرُّوها كما جاءت بلا كيف"؛ وهذا هو عين ما قرره الإمام أحمد رحمه الله في هذه الفقرة، وهو امتداد لما تقدم في الفقرة العاشرة من هذا المتن، حيث ذكر أن من لم يعرف تفسير الحديث ويعيا عنه عقله، فعليه الإيمان به والتسليم له.</w:t>
       </w:r>
     </w:p>
     <w:p>
@@ -10055,7 +10103,7 @@
         <w:spacing w:after="140" w:before="320"/>
         <w:jc w:val="right"/>
       </w:pPr>
-      <w:bookmarkStart w:name="bm_faqrah_18" w:id="1027"/>
+      <w:bookmarkStart w:name="bm_faqrah_18" w:id="1028"/>
       <w:r>
         <w:rPr>
           <w:rFonts w:ascii="Aref Ruqaa" w:cs="Aref Ruqaa" w:eastAsia="Aref Ruqaa" w:hAnsi="Aref Ruqaa"/>
@@ -10070,7 +10118,7 @@
         </w:rPr>
         <w:t xml:space="preserve">الفقرة الثامنة عشرة: الإيمان بالميزان</w:t>
       </w:r>
-      <w:bookmarkEnd w:id="1027"/>
+      <w:bookmarkEnd w:id="1028"/>
     </w:p>
     <w:p>
       <w:pPr>
@@ -10277,7 +10325,7 @@
           <w:szCs w:val="26"/>
           <w:rtl/>
         </w:rPr>
-        <w:t xml:space="preserve">﴿فَمَنْ ثَقُلَتْ مَوَازِينُهُ فَأُولَٰئِكَ هُمُ الْمُفْلِحُونَ * وَمَنْ خَفَّتْ مَوَازِينُهُ فَأُولَٰئِكَ الَّذِينَ خَسِرُوا أَنْفُسَهُمْ﴾</w:t>
+        <w:t xml:space="preserve">﴿فَمَنْ ثَقُلَتْ مَوَازِينُهُ فَأُولَٰئِكَ هُمُ الْمُفْلِحُونَ * وَمَنْ خَفَّتْ مَوَازِينُهُ فَأُولَٰئِكَ الَّذِينَ خَسِرُوا أَنْفُسَهُمْ فِي جَهَنَّمَ خَالِدُونَ﴾</w:t>
       </w:r>
       <w:r>
         <w:rPr>
@@ -10517,7 +10565,7 @@
         <w:spacing w:after="140" w:before="320"/>
         <w:jc w:val="right"/>
       </w:pPr>
-      <w:bookmarkStart w:name="bm_faqrah_19" w:id="1028"/>
+      <w:bookmarkStart w:name="bm_faqrah_19" w:id="1029"/>
       <w:r>
         <w:rPr>
           <w:rFonts w:ascii="Aref Ruqaa" w:cs="Aref Ruqaa" w:eastAsia="Aref Ruqaa" w:hAnsi="Aref Ruqaa"/>
@@ -10532,7 +10580,7 @@
         </w:rPr>
         <w:t xml:space="preserve">الفقرة التاسعة عشرة: تكليم الله لعباده يوم القيامة</w:t>
       </w:r>
-      <w:bookmarkEnd w:id="1028"/>
+      <w:bookmarkEnd w:id="1029"/>
     </w:p>
     <w:p>
       <w:pPr>
@@ -10937,7 +10985,7 @@
         <w:spacing w:after="140" w:before="320"/>
         <w:jc w:val="right"/>
       </w:pPr>
-      <w:bookmarkStart w:name="bm_faqrah_20" w:id="1029"/>
+      <w:bookmarkStart w:name="bm_faqrah_20" w:id="1030"/>
       <w:r>
         <w:rPr>
           <w:rFonts w:ascii="Aref Ruqaa" w:cs="Aref Ruqaa" w:eastAsia="Aref Ruqaa" w:hAnsi="Aref Ruqaa"/>
@@ -10952,7 +11000,7 @@
         </w:rPr>
         <w:t xml:space="preserve">الفقرة العشرون: الإيمان بالحوض</w:t>
       </w:r>
-      <w:bookmarkEnd w:id="1029"/>
+      <w:bookmarkEnd w:id="1030"/>
     </w:p>
     <w:p>
       <w:pPr>
@@ -11201,7 +11249,7 @@
           <w:szCs w:val="22"/>
           <w:rtl/>
         </w:rPr>
-        <w:t xml:space="preserve"> الحوض من خصائص النبي ﷺ التي أكرمه الله بها، ولا يشاركه فيها أحد من الأنبياء والمرسلين، وإن كان قد ورد في بعض الآثار أن لكل نبي حوضاً، إلا أن حوض نبينا ﷺ أعظمها وأكثرها واردين، كما جاء في الحديث: «إِنَّ لِكُلِّ نَبِيٍّ حَوْضاً، وَإِنَّهُمْ يَتَبَاهَوْنَ أَيُّهُمْ أَكْثَرُ وَارِدَةً، وَإِنِّي أَرْجُو أَنْ أَكُونَ أَكْثَرَهُمْ وَارِدَةً» (رواه الترمذي).</w:t>
+        <w:t xml:space="preserve"> الحوض من أعظم ما أكرم الله به نبينا ﷺ، وقد ورد في بعض الآثار أن لكل نبي حوضاً، كما جاء في الحديث: «إِنَّ لِكُلِّ نَبِيٍّ حَوْضاً، وَإِنَّهُمْ يَتَبَاهَوْنَ أَيُّهُمْ أَكْثَرُ وَارِدَةً، وَإِنِّي أَرْجُو أَنْ أَكُونَ أَكْثَرَهُمْ وَارِدَةً» (رواه الترمذي، وقد استغربه، وذكر أن المرسل منه أصح عنده؛ وإسناده وإن كان محل كلام عند بعض أهل الحديث، فقد صححه جماعة من المتأخرين). وعلى كل حال فحوض نبينا ﷺ هو أعظم هذه الأحواض وأكثرها واردين، كما دل عليه هذا الحديث نفسه.</w:t>
       </w:r>
     </w:p>
     <w:p>
@@ -11357,7 +11405,7 @@
         <w:spacing w:after="140" w:before="320"/>
         <w:jc w:val="right"/>
       </w:pPr>
-      <w:bookmarkStart w:name="bm_faqrah_21" w:id="1030"/>
+      <w:bookmarkStart w:name="bm_faqrah_21" w:id="1031"/>
       <w:r>
         <w:rPr>
           <w:rFonts w:ascii="Aref Ruqaa" w:cs="Aref Ruqaa" w:eastAsia="Aref Ruqaa" w:hAnsi="Aref Ruqaa"/>
@@ -11372,7 +11420,7 @@
         </w:rPr>
         <w:t xml:space="preserve">الفقرة الحادية والعشرون: عذاب القبر وسؤال منكر ونكير</w:t>
       </w:r>
-      <w:bookmarkEnd w:id="1030"/>
+      <w:bookmarkEnd w:id="1031"/>
     </w:p>
     <w:p>
       <w:pPr>
@@ -11860,7 +11908,7 @@
         <w:spacing w:after="140" w:before="320"/>
         <w:jc w:val="right"/>
       </w:pPr>
-      <w:bookmarkStart w:name="bm_faqrah_22" w:id="1031"/>
+      <w:bookmarkStart w:name="bm_faqrah_22" w:id="1032"/>
       <w:r>
         <w:rPr>
           <w:rFonts w:ascii="Aref Ruqaa" w:cs="Aref Ruqaa" w:eastAsia="Aref Ruqaa" w:hAnsi="Aref Ruqaa"/>
@@ -11875,7 +11923,7 @@
         </w:rPr>
         <w:t xml:space="preserve">الفقرة الثانية والعشرون: الشفاعة وإخراج الموحدين من النار</w:t>
       </w:r>
-      <w:bookmarkEnd w:id="1031"/>
+      <w:bookmarkEnd w:id="1032"/>
     </w:p>
     <w:p>
       <w:pPr>
@@ -12026,7 +12074,7 @@
           <w:szCs w:val="22"/>
           <w:rtl/>
         </w:rPr>
-        <w:t xml:space="preserve">والثاني قوله ﷺ: «يَخْرُجُ قَوْمٌ مِنَ النَّارِ بَعْدَ مَا أَصَابَهُمْ فِيهَا مِنْ عَذَابٍ، ثُمَّ يُدْخَلُونَ الْجَنَّةَ» (رواه البخاري ومسلم)، وهذا الحديث ثابت في الصحيحين بألفاظ متقاربة، وفيه تفصيل قصة إخراج الموحدين من النار، وأنهم يُعرَفون في النار بآثار السجود التي حرّمها الله على النار، ثم يُلقَون في نهر الحياة فينبتون كما تنبت الحِبَّة في حميل السيل، ثم يدخلون الجنة، ويُسمَّون "عتقاء الله من النار".</w:t>
+        <w:t xml:space="preserve">والثاني قوله ﷺ: «يَخْرُجُ قَوْمٌ مِنَ النَّارِ بَعْدَ مَا أَصَابَهُمْ فِيهَا مِنْ عَذَابٍ، ثُمَّ يُدْخَلُونَ الْجَنَّةَ» (رواه البخاري ومسلم)، وهذا الحديث ثابت في الصحيحين بألفاظ متقاربة، وفيه تفصيل قصة إخراج الموحدين من النار، وأنهم يُعرَفون في النار بآثار السجود التي حرّمها الله على النار، ثم يُلقَون في نهر الحياة فينبتون كما تنبت الحِبَّة في حميل السيل، ثم يدخلون الجنة، ويُسمِّيهم أهل الجنة "الجهنميين"، كما جاء ذلك في صحيح البخاري.</w:t>
       </w:r>
     </w:p>
     <w:p>
@@ -12238,7 +12286,7 @@
         <w:spacing w:after="140" w:before="320"/>
         <w:jc w:val="right"/>
       </w:pPr>
-      <w:bookmarkStart w:name="bm_faqrah_23" w:id="1032"/>
+      <w:bookmarkStart w:name="bm_faqrah_23" w:id="1033"/>
       <w:r>
         <w:rPr>
           <w:rFonts w:ascii="Aref Ruqaa" w:cs="Aref Ruqaa" w:eastAsia="Aref Ruqaa" w:hAnsi="Aref Ruqaa"/>
@@ -12253,7 +12301,7 @@
         </w:rPr>
         <w:t xml:space="preserve">الفقرة الثالثة والعشرون: خروج الدجال ونزول عيسى عليه السلام</w:t>
       </w:r>
-      <w:bookmarkEnd w:id="1032"/>
+      <w:bookmarkEnd w:id="1033"/>
     </w:p>
     <w:p>
       <w:pPr>
@@ -12659,7 +12707,7 @@
         <w:spacing w:after="160" w:before="0"/>
         <w:jc w:val="right"/>
       </w:pPr>
-      <w:bookmarkStart w:name="bm_bab5" w:id="1033"/>
+      <w:bookmarkStart w:name="bm_bab5" w:id="1034"/>
       <w:r>
         <w:rPr>
           <w:rFonts w:ascii="Aref Ruqaa" w:cs="Aref Ruqaa" w:eastAsia="Aref Ruqaa" w:hAnsi="Aref Ruqaa"/>
@@ -12674,7 +12722,7 @@
         </w:rPr>
         <w:t xml:space="preserve">الباب الخامس — في حقيقة الإيمان وحكم تارك الصلاة</w:t>
       </w:r>
-      <w:bookmarkEnd w:id="1033"/>
+      <w:bookmarkEnd w:id="1034"/>
     </w:p>
     <w:p>
       <w:pPr>
@@ -12683,7 +12731,7 @@
         <w:spacing w:after="140" w:before="320"/>
         <w:jc w:val="right"/>
       </w:pPr>
-      <w:bookmarkStart w:name="bm_faqrah_24" w:id="1034"/>
+      <w:bookmarkStart w:name="bm_faqrah_24" w:id="1035"/>
       <w:r>
         <w:rPr>
           <w:rFonts w:ascii="Aref Ruqaa" w:cs="Aref Ruqaa" w:eastAsia="Aref Ruqaa" w:hAnsi="Aref Ruqaa"/>
@@ -12698,7 +12746,7 @@
         </w:rPr>
         <w:t xml:space="preserve">الفقرة الرابعة والعشرون: الإيمان قول وعمل يزيد وينقص</w:t>
       </w:r>
-      <w:bookmarkEnd w:id="1034"/>
+      <w:bookmarkEnd w:id="1035"/>
     </w:p>
     <w:p>
       <w:pPr>
@@ -13095,7 +13143,7 @@
         <w:spacing w:after="140" w:before="320"/>
         <w:jc w:val="right"/>
       </w:pPr>
-      <w:bookmarkStart w:name="bm_faqrah_25" w:id="1035"/>
+      <w:bookmarkStart w:name="bm_faqrah_25" w:id="1036"/>
       <w:r>
         <w:rPr>
           <w:rFonts w:ascii="Aref Ruqaa" w:cs="Aref Ruqaa" w:eastAsia="Aref Ruqaa" w:hAnsi="Aref Ruqaa"/>
@@ -13110,7 +13158,7 @@
         </w:rPr>
         <w:t xml:space="preserve">الفقرة الخامسة والعشرون: حكم تارك الصلاة</w:t>
       </w:r>
-      <w:bookmarkEnd w:id="1035"/>
+      <w:bookmarkEnd w:id="1036"/>
     </w:p>
     <w:p>
       <w:pPr>
@@ -13452,7 +13500,7 @@
         <w:spacing w:after="160" w:before="0"/>
         <w:jc w:val="right"/>
       </w:pPr>
-      <w:bookmarkStart w:name="bm_bab6" w:id="1036"/>
+      <w:bookmarkStart w:name="bm_bab6" w:id="1037"/>
       <w:r>
         <w:rPr>
           <w:rFonts w:ascii="Aref Ruqaa" w:cs="Aref Ruqaa" w:eastAsia="Aref Ruqaa" w:hAnsi="Aref Ruqaa"/>
@@ -13467,7 +13515,7 @@
         </w:rPr>
         <w:t xml:space="preserve">الباب السادس — في فضائل الصحابة ومراتبهم</w:t>
       </w:r>
-      <w:bookmarkEnd w:id="1036"/>
+      <w:bookmarkEnd w:id="1037"/>
     </w:p>
     <w:p>
       <w:pPr>
@@ -13476,7 +13524,7 @@
         <w:spacing w:after="140" w:before="320"/>
         <w:jc w:val="right"/>
       </w:pPr>
-      <w:bookmarkStart w:name="bm_faqrah_26" w:id="1037"/>
+      <w:bookmarkStart w:name="bm_faqrah_26" w:id="1038"/>
       <w:r>
         <w:rPr>
           <w:rFonts w:ascii="Aref Ruqaa" w:cs="Aref Ruqaa" w:eastAsia="Aref Ruqaa" w:hAnsi="Aref Ruqaa"/>
@@ -13491,7 +13539,7 @@
         </w:rPr>
         <w:t xml:space="preserve">الفقرة السادسة والعشرون: تفضيل الخلفاء الراشدين الثلاثة</w:t>
       </w:r>
-      <w:bookmarkEnd w:id="1037"/>
+      <w:bookmarkEnd w:id="1038"/>
     </w:p>
     <w:p>
       <w:pPr>
@@ -14097,7 +14145,7 @@
         <w:spacing w:after="140" w:before="320"/>
         <w:jc w:val="right"/>
       </w:pPr>
-      <w:bookmarkStart w:name="bm_faqrah_27" w:id="1038"/>
+      <w:bookmarkStart w:name="bm_faqrah_27" w:id="1039"/>
       <w:r>
         <w:rPr>
           <w:rFonts w:ascii="Aref Ruqaa" w:cs="Aref Ruqaa" w:eastAsia="Aref Ruqaa" w:hAnsi="Aref Ruqaa"/>
@@ -14112,7 +14160,7 @@
         </w:rPr>
         <w:t xml:space="preserve">الفقرة السابعة والعشرون: أصحاب الشورى الستة</w:t>
       </w:r>
-      <w:bookmarkEnd w:id="1038"/>
+      <w:bookmarkEnd w:id="1039"/>
     </w:p>
     <w:p>
       <w:pPr>
@@ -14704,7 +14752,7 @@
         <w:spacing w:after="140" w:before="320"/>
         <w:jc w:val="right"/>
       </w:pPr>
-      <w:bookmarkStart w:name="bm_faqrah_28" w:id="1039"/>
+      <w:bookmarkStart w:name="bm_faqrah_28" w:id="1040"/>
       <w:r>
         <w:rPr>
           <w:rFonts w:ascii="Aref Ruqaa" w:cs="Aref Ruqaa" w:eastAsia="Aref Ruqaa" w:hAnsi="Aref Ruqaa"/>
@@ -14719,7 +14767,7 @@
         </w:rPr>
         <w:t xml:space="preserve">الفقرة الثامنة والعشرون: أهل بدر وسائر الصحابة ومراتب الصحبة</w:t>
       </w:r>
-      <w:bookmarkEnd w:id="1039"/>
+      <w:bookmarkEnd w:id="1040"/>
     </w:p>
     <w:p>
       <w:pPr>
@@ -15471,7 +15519,7 @@
         <w:spacing w:after="160" w:before="0"/>
         <w:jc w:val="right"/>
       </w:pPr>
-      <w:bookmarkStart w:name="bm_bab7" w:id="1040"/>
+      <w:bookmarkStart w:name="bm_bab7" w:id="1041"/>
       <w:r>
         <w:rPr>
           <w:rFonts w:ascii="Aref Ruqaa" w:cs="Aref Ruqaa" w:eastAsia="Aref Ruqaa" w:hAnsi="Aref Ruqaa"/>
@@ -15486,7 +15534,7 @@
         </w:rPr>
         <w:t xml:space="preserve">الباب السابع — في الإمامة والسمع والطاعة وأحكام الجهاد والجمعة</w:t>
       </w:r>
-      <w:bookmarkEnd w:id="1040"/>
+      <w:bookmarkEnd w:id="1041"/>
     </w:p>
     <w:p>
       <w:pPr>
@@ -15495,7 +15543,7 @@
         <w:spacing w:after="140" w:before="320"/>
         <w:jc w:val="right"/>
       </w:pPr>
-      <w:bookmarkStart w:name="bm_faqrah_29" w:id="1041"/>
+      <w:bookmarkStart w:name="bm_faqrah_29" w:id="1042"/>
       <w:r>
         <w:rPr>
           <w:rFonts w:ascii="Aref Ruqaa" w:cs="Aref Ruqaa" w:eastAsia="Aref Ruqaa" w:hAnsi="Aref Ruqaa"/>
@@ -15510,7 +15558,7 @@
         </w:rPr>
         <w:t xml:space="preserve">الفقرة التاسعة والعشرون: السمع والطاعة لولاة الأمر</w:t>
       </w:r>
-      <w:bookmarkEnd w:id="1041"/>
+      <w:bookmarkEnd w:id="1042"/>
     </w:p>
     <w:p>
       <w:pPr>
@@ -16012,7 +16060,7 @@
         <w:spacing w:after="140" w:before="320"/>
         <w:jc w:val="right"/>
       </w:pPr>
-      <w:bookmarkStart w:name="bm_faqrah_30" w:id="1042"/>
+      <w:bookmarkStart w:name="bm_faqrah_30" w:id="1043"/>
       <w:r>
         <w:rPr>
           <w:rFonts w:ascii="Aref Ruqaa" w:cs="Aref Ruqaa" w:eastAsia="Aref Ruqaa" w:hAnsi="Aref Ruqaa"/>
@@ -16027,7 +16075,7 @@
         </w:rPr>
         <w:t xml:space="preserve">الفقرة الثلاثون: الجهاد وقسمة الفيء وإقامة الحدود ودفع الصدقات مع كل إمام</w:t>
       </w:r>
-      <w:bookmarkEnd w:id="1042"/>
+      <w:bookmarkEnd w:id="1043"/>
     </w:p>
     <w:p>
       <w:pPr>
@@ -16737,7 +16785,7 @@
         <w:spacing w:after="140" w:before="320"/>
         <w:jc w:val="right"/>
       </w:pPr>
-      <w:bookmarkStart w:name="bm_faqrah_31" w:id="1043"/>
+      <w:bookmarkStart w:name="bm_faqrah_31" w:id="1044"/>
       <w:r>
         <w:rPr>
           <w:rFonts w:ascii="Aref Ruqaa" w:cs="Aref Ruqaa" w:eastAsia="Aref Ruqaa" w:hAnsi="Aref Ruqaa"/>
@@ -16752,7 +16800,7 @@
         </w:rPr>
         <w:t xml:space="preserve">الفقرة الحادية والثلاثون: صلاة الجمعة خلف كل إمام</w:t>
       </w:r>
-      <w:bookmarkEnd w:id="1043"/>
+      <w:bookmarkEnd w:id="1044"/>
     </w:p>
     <w:p>
       <w:pPr>
@@ -17170,7 +17218,7 @@
         <w:spacing w:after="140" w:before="320"/>
         <w:jc w:val="right"/>
       </w:pPr>
-      <w:bookmarkStart w:name="bm_faqrah_32" w:id="1044"/>
+      <w:bookmarkStart w:name="bm_faqrah_32" w:id="1045"/>
       <w:r>
         <w:rPr>
           <w:rFonts w:ascii="Aref Ruqaa" w:cs="Aref Ruqaa" w:eastAsia="Aref Ruqaa" w:hAnsi="Aref Ruqaa"/>
@@ -17185,7 +17233,7 @@
         </w:rPr>
         <w:t xml:space="preserve">الفقرة الثانية والثلاثون: ضوابط قتال اللصوص والخوارج دفاعاً عن النفس</w:t>
       </w:r>
-      <w:bookmarkEnd w:id="1044"/>
+      <w:bookmarkEnd w:id="1045"/>
     </w:p>
     <w:p>
       <w:pPr>
@@ -17361,7 +17409,7 @@
           <w:szCs w:val="22"/>
           <w:rtl/>
         </w:rPr>
-        <w:t xml:space="preserve">وموضع هذه الضوابط أن الدفاع عن النفس والمال حق مشروع لا ينازع فيه أحد، لكنه ليس رخصة لتولي القضاء بنفسك أو الانتقام أو تطبيق العقوبات، فهذه من خصائص ولي الأمر وحده، كما تقدم في الفقرة السابقة في مسألة إقامة الحدود. فالفرد يدفع الصائل عنه في حدود دفعه، فإذا زال الخطر انتهت رخصة القتال، وما بعد ذلك من ملاحقة أو عقوبة أو قصاص فمرجعه إلى السلطان، حفظاً من الفوضى وتفويضاً للأمور إلى أهل الاختصاص بها.</w:t>
+        <w:t xml:space="preserve">وموضع هذه الضوابط أن الدفاع عن النفس والمال حق مشروع لا ينازع فيه أحد، لكنه ليس رخصة لتولي القضاء بنفسك أو الانتقام أو تطبيق العقوبات، فهذه من خصائص ولي الأمر وحده، كما تقدم في الفقرة الثلاثين في مسألة إقامة الحدود. فالفرد يدفع الصائل عنه في حدود دفعه، فإذا زال الخطر انتهت رخصة القتال، وما بعد ذلك من ملاحقة أو عقوبة أو قصاص فمرجعه إلى السلطان، حفظاً من الفوضى وتفويضاً للأمور إلى أهل الاختصاص بها.</w:t>
       </w:r>
     </w:p>
     <w:p>
@@ -17796,7 +17844,7 @@
         <w:spacing w:after="160" w:before="0"/>
         <w:jc w:val="right"/>
       </w:pPr>
-      <w:bookmarkStart w:name="bm_bab8" w:id="1045"/>
+      <w:bookmarkStart w:name="bm_bab8" w:id="1046"/>
       <w:r>
         <w:rPr>
           <w:rFonts w:ascii="Aref Ruqaa" w:cs="Aref Ruqaa" w:eastAsia="Aref Ruqaa" w:hAnsi="Aref Ruqaa"/>
@@ -17811,7 +17859,7 @@
         </w:rPr>
         <w:t xml:space="preserve">الباب الثامن — في منهج أهل السنة مع أهل القبلة، والتوبة، وحرمة الصحابة، والغيبيات الختامية</w:t>
       </w:r>
-      <w:bookmarkEnd w:id="1045"/>
+      <w:bookmarkEnd w:id="1046"/>
     </w:p>
     <w:p>
       <w:pPr>
@@ -17820,7 +17868,7 @@
         <w:spacing w:after="140" w:before="320"/>
         <w:jc w:val="right"/>
       </w:pPr>
-      <w:bookmarkStart w:name="bm_faqrah_33" w:id="1046"/>
+      <w:bookmarkStart w:name="bm_faqrah_33" w:id="1047"/>
       <w:r>
         <w:rPr>
           <w:rFonts w:ascii="Aref Ruqaa" w:cs="Aref Ruqaa" w:eastAsia="Aref Ruqaa" w:hAnsi="Aref Ruqaa"/>
@@ -17835,7 +17883,7 @@
         </w:rPr>
         <w:t xml:space="preserve">الفقرة الثالثة والثلاثون: ترك الشهادة لأهل القبلة بجنة أو نار</w:t>
       </w:r>
-      <w:bookmarkEnd w:id="1046"/>
+      <w:bookmarkEnd w:id="1047"/>
     </w:p>
     <w:p>
       <w:pPr>
@@ -18163,7 +18211,7 @@
         <w:spacing w:after="140" w:before="320"/>
         <w:jc w:val="right"/>
       </w:pPr>
-      <w:bookmarkStart w:name="bm_faqrah_34" w:id="1047"/>
+      <w:bookmarkStart w:name="bm_faqrah_34" w:id="1048"/>
       <w:r>
         <w:rPr>
           <w:rFonts w:ascii="Aref Ruqaa" w:cs="Aref Ruqaa" w:eastAsia="Aref Ruqaa" w:hAnsi="Aref Ruqaa"/>
@@ -18178,7 +18226,7 @@
         </w:rPr>
         <w:t xml:space="preserve">الفقرة الرابعة والثلاثون: أحكام من لقي الله بذنبه، والتوبة، والرجم</w:t>
       </w:r>
-      <w:bookmarkEnd w:id="1047"/>
+      <w:bookmarkEnd w:id="1048"/>
     </w:p>
     <w:p>
       <w:pPr>
@@ -18665,7 +18713,7 @@
         <w:spacing w:after="140" w:before="320"/>
         <w:jc w:val="right"/>
       </w:pPr>
-      <w:bookmarkStart w:name="bm_faqrah_35" w:id="1048"/>
+      <w:bookmarkStart w:name="bm_faqrah_35" w:id="1049"/>
       <w:r>
         <w:rPr>
           <w:rFonts w:ascii="Aref Ruqaa" w:cs="Aref Ruqaa" w:eastAsia="Aref Ruqaa" w:hAnsi="Aref Ruqaa"/>
@@ -18680,7 +18728,7 @@
         </w:rPr>
         <w:t xml:space="preserve">الفقرة الخامسة والثلاثون: حرمة انتقاص الصحابة</w:t>
       </w:r>
-      <w:bookmarkEnd w:id="1048"/>
+      <w:bookmarkEnd w:id="1049"/>
     </w:p>
     <w:p>
       <w:pPr>
@@ -18966,7 +19014,7 @@
         <w:spacing w:after="140" w:before="320"/>
         <w:jc w:val="right"/>
       </w:pPr>
-      <w:bookmarkStart w:name="bm_faqrah_36" w:id="1049"/>
+      <w:bookmarkStart w:name="bm_faqrah_36" w:id="1050"/>
       <w:r>
         <w:rPr>
           <w:rFonts w:ascii="Aref Ruqaa" w:cs="Aref Ruqaa" w:eastAsia="Aref Ruqaa" w:hAnsi="Aref Ruqaa"/>
@@ -18981,7 +19029,7 @@
         </w:rPr>
         <w:t xml:space="preserve">الفقرة السادسة والثلاثون: النفاق الأكبر وأحاديث الوعيد</w:t>
       </w:r>
-      <w:bookmarkEnd w:id="1049"/>
+      <w:bookmarkEnd w:id="1050"/>
     </w:p>
     <w:p>
       <w:pPr>
@@ -19439,7 +19487,7 @@
         <w:spacing w:after="140" w:before="320"/>
         <w:jc w:val="right"/>
       </w:pPr>
-      <w:bookmarkStart w:name="bm_faqrah_37" w:id="1050"/>
+      <w:bookmarkStart w:name="bm_faqrah_37" w:id="1051"/>
       <w:r>
         <w:rPr>
           <w:rFonts w:ascii="Aref Ruqaa" w:cs="Aref Ruqaa" w:eastAsia="Aref Ruqaa" w:hAnsi="Aref Ruqaa"/>
@@ -19454,7 +19502,7 @@
         </w:rPr>
         <w:t xml:space="preserve">الفقرة السابعة والثلاثون: الجنة والنار مخلوقتان موجودتان الآن</w:t>
       </w:r>
-      <w:bookmarkEnd w:id="1050"/>
+      <w:bookmarkEnd w:id="1051"/>
     </w:p>
     <w:p>
       <w:pPr>
@@ -19521,7 +19569,7 @@
           <w:szCs w:val="22"/>
           <w:rtl/>
         </w:rPr>
-        <w:t xml:space="preserve">يقرر الإمام أحمد رحمه الله في هذه الفقرة أصلاً من أصول الغيبيات، وهو أن الجنة والنار مخلوقتان موجودتان الآن، لم تُخلقا مستقبلاً يوم القيامة كما زعمت المعتزلة، بل هما مخلوقتان قائمتان بالفعل منذ خُلقتا، ينعّم الله فيهما ويعذّب من يشاء. ويرى الإمام أن إنكار هذا الأصل مكذّب بصريح القرآن وبأحاديث النبي صلى الله عليه وسلم الثابتة في رؤيته لهما ليلة الإسراء والمعراج.</w:t>
+        <w:t xml:space="preserve">يقرر الإمام أحمد رحمه الله في هذه الفقرة أصلاً من أصول الغيبيات، وهو أن الجنة والنار مخلوقتان موجودتان الآن، لم تُخلقا مستقبلاً يوم القيامة كما زعمت المعتزلة، بل هما مخلوقتان قائمتان بالفعل منذ خُلقتا، ينعّم الله فيهما ويعذّب من يشاء. ويرى الإمام أن إنكار هذا الأصل مكذّب بصريح القرآن وبأحاديث النبي صلى الله عليه وسلم الثابتة في مشاهداته المتعددة لهما، منها ما كان ليلة الإسراء والمعراج، ومنها ما كان في مناسبات أخرى.</w:t>
       </w:r>
     </w:p>
     <w:p>
@@ -19716,7 +19764,7 @@
           <w:szCs w:val="22"/>
           <w:rtl/>
         </w:rPr>
-        <w:t xml:space="preserve"> في ختام هذا المتن بمثل هذه الفقرات الثلاث الأخيرة (33-38) حكمة ظاهرة؛ فالإمام أحمد يختم رسالته بمسائل اليوم الآخر ومصير العباد، بعد أن فرغ من تقرير أصول الاعتقاد الكبرى، وكأنه يذكّر القارئ في ختام الرسالة بغاية كل هذا العلم: الاستعداد للقاء الله والفوز بجنته والنجاة من ناره.</w:t>
+        <w:t xml:space="preserve"> في ختام هذا المتن بمثل هذه الفقرات الست الأخيرة (33-38) حكمة ظاهرة؛ فالإمام أحمد يختم رسالته بمسائل اليوم الآخر ومصير العباد، بعد أن فرغ من تقرير أصول الاعتقاد الكبرى، وكأنه يذكّر القارئ في ختام الرسالة بغاية كل هذا العلم: الاستعداد للقاء الله والفوز بجنته والنجاة من ناره.</w:t>
       </w:r>
     </w:p>
     <w:p>
@@ -19837,7 +19885,7 @@
         <w:spacing w:after="140" w:before="320"/>
         <w:jc w:val="right"/>
       </w:pPr>
-      <w:bookmarkStart w:name="bm_faqrah_38" w:id="1051"/>
+      <w:bookmarkStart w:name="bm_faqrah_38" w:id="1052"/>
       <w:r>
         <w:rPr>
           <w:rFonts w:ascii="Aref Ruqaa" w:cs="Aref Ruqaa" w:eastAsia="Aref Ruqaa" w:hAnsi="Aref Ruqaa"/>
@@ -19852,7 +19900,7 @@
         </w:rPr>
         <w:t xml:space="preserve">الفقرة الثامنة والثلاثون والأخيرة: الصلاة على كل موحد والاستغفار له</w:t>
       </w:r>
-      <w:bookmarkEnd w:id="1051"/>
+      <w:bookmarkEnd w:id="1052"/>
     </w:p>
     <w:p>
       <w:pPr>
@@ -20139,7 +20187,7 @@
         <w:spacing w:after="200" w:before="0"/>
         <w:jc w:val="right"/>
       </w:pPr>
-      <w:bookmarkStart w:name="bm_khatimah" w:id="1052"/>
+      <w:bookmarkStart w:name="bm_khatimah" w:id="1053"/>
       <w:r>
         <w:rPr>
           <w:rFonts w:ascii="Aref Ruqaa" w:cs="Aref Ruqaa" w:eastAsia="Aref Ruqaa" w:hAnsi="Aref Ruqaa"/>
@@ -20154,7 +20202,7 @@
         </w:rPr>
         <w:t xml:space="preserve">خاتمة الكتاب</w:t>
       </w:r>
-      <w:bookmarkEnd w:id="1052"/>
+      <w:bookmarkEnd w:id="1053"/>
     </w:p>
     <w:p>
       <w:pPr>
@@ -20367,7 +20415,7 @@
         <w:spacing w:after="200" w:before="0"/>
         <w:jc w:val="right"/>
       </w:pPr>
-      <w:bookmarkStart w:name="bm_bibliography" w:id="1053"/>
+      <w:bookmarkStart w:name="bm_bibliography" w:id="1054"/>
       <w:r>
         <w:rPr>
           <w:rFonts w:ascii="Aref Ruqaa" w:cs="Aref Ruqaa" w:eastAsia="Aref Ruqaa" w:hAnsi="Aref Ruqaa"/>
@@ -20382,7 +20430,7 @@
         </w:rPr>
         <w:t xml:space="preserve">قائمة المصادر</w:t>
       </w:r>
-      <w:bookmarkEnd w:id="1053"/>
+      <w:bookmarkEnd w:id="1054"/>
     </w:p>
     <w:p>
       <w:pPr>
@@ -20412,7 +20460,7 @@
         <w:spacing w:after="120" w:before="260"/>
         <w:jc w:val="right"/>
       </w:pPr>
-      <w:bookmarkStart w:name="bm_5" w:id="1054"/>
+      <w:bookmarkStart w:name="bm_5" w:id="1055"/>
       <w:r>
         <w:rPr>
           <w:rFonts w:ascii="Aref Ruqaa" w:cs="Aref Ruqaa" w:eastAsia="Aref Ruqaa" w:hAnsi="Aref Ruqaa"/>
@@ -20427,7 +20475,7 @@
         </w:rPr>
         <w:t xml:space="preserve">المتن الأصلي</w:t>
       </w:r>
-      <w:bookmarkEnd w:id="1054"/>
+      <w:bookmarkEnd w:id="1055"/>
     </w:p>
     <w:p>
       <w:pPr>
@@ -20476,7 +20524,7 @@
         <w:spacing w:after="120" w:before="260"/>
         <w:jc w:val="right"/>
       </w:pPr>
-      <w:bookmarkStart w:name="bm_6" w:id="1055"/>
+      <w:bookmarkStart w:name="bm_6" w:id="1056"/>
       <w:r>
         <w:rPr>
           <w:rFonts w:ascii="Aref Ruqaa" w:cs="Aref Ruqaa" w:eastAsia="Aref Ruqaa" w:hAnsi="Aref Ruqaa"/>
@@ -20491,7 +20539,7 @@
         </w:rPr>
         <w:t xml:space="preserve">دواوين السنة المروي عنها في هذا الشرح</w:t>
       </w:r>
-      <w:bookmarkEnd w:id="1055"/>
+      <w:bookmarkEnd w:id="1056"/>
     </w:p>
     <w:p>
       <w:pPr>
@@ -20780,7 +20828,7 @@
         <w:spacing w:after="120" w:before="260"/>
         <w:jc w:val="right"/>
       </w:pPr>
-      <w:bookmarkStart w:name="bm_7" w:id="1056"/>
+      <w:bookmarkStart w:name="bm_7" w:id="1057"/>
       <w:r>
         <w:rPr>
           <w:rFonts w:ascii="Aref Ruqaa" w:cs="Aref Ruqaa" w:eastAsia="Aref Ruqaa" w:hAnsi="Aref Ruqaa"/>
@@ -20795,7 +20843,7 @@
         </w:rPr>
         <w:t xml:space="preserve">أئمة مذكورون في متن الشرح</w:t>
       </w:r>
-      <w:bookmarkEnd w:id="1056"/>
+      <w:bookmarkEnd w:id="1057"/>
     </w:p>
     <w:p>
       <w:pPr>
@@ -21014,6 +21062,144 @@
     </w:p>
     <w:p>
       <w:pPr>
+        <w:pStyle w:val="Heading1"/>
+        <w:pageBreakBefore/>
+        <w:bidi/>
+        <w:spacing w:after="200" w:before="0"/>
+        <w:jc w:val="right"/>
+      </w:pPr>
+      <w:bookmarkStart w:name="bm_index_ayat" w:id="1058"/>
+      <w:r>
+        <w:rPr>
+          <w:rFonts w:ascii="Aref Ruqaa" w:cs="Aref Ruqaa" w:eastAsia="Aref Ruqaa" w:hAnsi="Aref Ruqaa"/>
+          <w:b/>
+          <w:bCs/>
+          <w:i w:val="false"/>
+          <w:iCs w:val="false"/>
+          <w:color w:val="0D2143"/>
+          <w:sz w:val="32"/>
+          <w:szCs w:val="32"/>
+          <w:rtl/>
+        </w:rPr>
+        <w:t xml:space="preserve">فهرس الآيات القرآنية</w:t>
+      </w:r>
+      <w:bookmarkEnd w:id="1058"/>
+    </w:p>
+    <w:p>
+      <w:pPr>
+        <w:bidi/>
+        <w:spacing w:after="140" w:before="0" w:line="300"/>
+        <w:jc w:val="both"/>
+      </w:pPr>
+      <w:r>
+        <w:rPr>
+          <w:rFonts w:ascii="Amiri" w:cs="Amiri" w:eastAsia="Amiri" w:hAnsi="Amiri"/>
+          <w:b w:val="false"/>
+          <w:bCs w:val="false"/>
+          <w:i w:val="false"/>
+          <w:iCs w:val="false"/>
+          <w:color w:val="181410"/>
+          <w:sz w:val="22"/>
+          <w:szCs w:val="22"/>
+          <w:rtl/>
+        </w:rPr>
+        <w:t xml:space="preserve">مرتبة بترتيب المصحف الشريف، ومشار فيها إلى الفقرة التي وردت فيها كل آية.</w:t>
+      </w:r>
+    </w:p>
+    <w:p>
+      <w:pPr>
+        <w:pStyle w:val="Heading1"/>
+        <w:pageBreakBefore/>
+        <w:bidi/>
+        <w:spacing w:after="200" w:before="0"/>
+        <w:jc w:val="right"/>
+      </w:pPr>
+      <w:bookmarkStart w:name="bm_index_hadith" w:id="1059"/>
+      <w:r>
+        <w:rPr>
+          <w:rFonts w:ascii="Aref Ruqaa" w:cs="Aref Ruqaa" w:eastAsia="Aref Ruqaa" w:hAnsi="Aref Ruqaa"/>
+          <w:b/>
+          <w:bCs/>
+          <w:i w:val="false"/>
+          <w:iCs w:val="false"/>
+          <w:color w:val="0D2143"/>
+          <w:sz w:val="32"/>
+          <w:szCs w:val="32"/>
+          <w:rtl/>
+        </w:rPr>
+        <w:t xml:space="preserve">فهرس الأحاديث النبوية</w:t>
+      </w:r>
+      <w:bookmarkEnd w:id="1059"/>
+    </w:p>
+    <w:p>
+      <w:pPr>
+        <w:bidi/>
+        <w:spacing w:after="140" w:before="0" w:line="300"/>
+        <w:jc w:val="both"/>
+      </w:pPr>
+      <w:r>
+        <w:rPr>
+          <w:rFonts w:ascii="Amiri" w:cs="Amiri" w:eastAsia="Amiri" w:hAnsi="Amiri"/>
+          <w:b w:val="false"/>
+          <w:bCs w:val="false"/>
+          <w:i w:val="false"/>
+          <w:iCs w:val="false"/>
+          <w:color w:val="181410"/>
+          <w:sz w:val="22"/>
+          <w:szCs w:val="22"/>
+          <w:rtl/>
+        </w:rPr>
+        <w:t xml:space="preserve">مرتبة على حروف المعجم بحسب طرف الحديث.</w:t>
+      </w:r>
+    </w:p>
+    <w:p>
+      <w:pPr>
+        <w:pStyle w:val="Heading1"/>
+        <w:pageBreakBefore/>
+        <w:bidi/>
+        <w:spacing w:after="200" w:before="0"/>
+        <w:jc w:val="right"/>
+      </w:pPr>
+      <w:bookmarkStart w:name="bm_index_alaam" w:id="1060"/>
+      <w:r>
+        <w:rPr>
+          <w:rFonts w:ascii="Aref Ruqaa" w:cs="Aref Ruqaa" w:eastAsia="Aref Ruqaa" w:hAnsi="Aref Ruqaa"/>
+          <w:b/>
+          <w:bCs/>
+          <w:i w:val="false"/>
+          <w:iCs w:val="false"/>
+          <w:color w:val="0D2143"/>
+          <w:sz w:val="32"/>
+          <w:szCs w:val="32"/>
+          <w:rtl/>
+        </w:rPr>
+        <w:t xml:space="preserve">فهرس الأعلام</w:t>
+      </w:r>
+      <w:bookmarkEnd w:id="1060"/>
+    </w:p>
+    <w:p>
+      <w:pPr>
+        <w:bidi/>
+        <w:spacing w:after="140" w:before="0" w:line="300"/>
+        <w:jc w:val="both"/>
+      </w:pPr>
+      <w:r>
+        <w:rPr>
+          <w:rFonts w:ascii="Amiri" w:cs="Amiri" w:eastAsia="Amiri" w:hAnsi="Amiri"/>
+          <w:b w:val="false"/>
+          <w:bCs w:val="false"/>
+          <w:i w:val="false"/>
+          <w:iCs w:val="false"/>
+          <w:color w:val="181410"/>
+          <w:sz w:val="22"/>
+          <w:szCs w:val="22"/>
+          <w:rtl/>
+        </w:rPr>
+        <w:t xml:space="preserve">أسماء الصحابة والأئمة وأهل العلم المذكورين في هذا الشرح.</w:t>
+      </w:r>
+    </w:p>
+    <w:p>
+      <w:pPr>
         <w:spacing w:after="800"/>
       </w:pPr>
     </w:p>
@@ -21414,7 +21600,7 @@
         <w:spacing w:after="200" w:before="0"/>
         <w:jc w:val="right"/>
       </w:pPr>
-      <w:bookmarkStart w:name="bm_native_index" w:id="1057"/>
+      <w:bookmarkStart w:name="bm_native_index" w:id="1061"/>
       <w:r>
         <w:rPr>
           <w:rFonts w:ascii="Aref Ruqaa" w:cs="Aref Ruqaa" w:eastAsia="Aref Ruqaa" w:hAnsi="Aref Ruqaa"/>
@@ -21429,7 +21615,7 @@
         </w:rPr>
         <w:t xml:space="preserve">الفهرس التحليلي</w:t>
       </w:r>
-      <w:bookmarkEnd w:id="1057"/>
+      <w:bookmarkEnd w:id="1061"/>
     </w:p>
     <w:p>
       <w:pPr>

</xml_diff>

<commit_message>
Book 50: regenerate PDF (117pp)/DOCX after final exhaustive reverification round
</commit_message>
<xml_diff>
--- a/fusul-al-ummah/exports/فصول الأمة - شرح أصول السنة.docx
+++ b/fusul-al-ummah/exports/فصول الأمة - شرح أصول السنة.docx
@@ -46,7 +46,7 @@
           <w:szCs w:val="24"/>
           <w:rtl/>
         </w:rPr>
-        <w:t xml:space="preserve">شرح أصول السنة للإمام أحمد بن حنبل رضي الله عنه</w:t>
+        <w:t xml:space="preserve">شرح أصول السنة للإمام أحمد بن حنبل رحمه الله</w:t>
       </w:r>
     </w:p>
     <w:p>
@@ -337,7 +337,7 @@
           <w:szCs w:val="20"/>
           <w:rtl/>
         </w:rPr>
-        <w:t xml:space="preserve">شرح أصول السنة للإمام أحمد بن حنبل رضي الله عنه</w:t>
+        <w:t xml:space="preserve">شرح أصول السنة للإمام أحمد بن حنبل رحمه الله</w:t>
       </w:r>
     </w:p>
     <w:p>
@@ -2989,7 +2989,49 @@
           <w:szCs w:val="22"/>
           <w:rtl/>
         </w:rPr>
-        <w:t xml:space="preserve">وقال النبي ﷺ: «مَا ضَلَّ قَوْمٌ بَعْدَ هُدًى كَانُوا عَلَيْهِ إِلَّا أُوتُوا الْجَدَلَ» (رواه الترمذي)، ثم تلا النبي ﷺ الآية السابقة، فربط بين كثرة الجدل وبين الضلال بعد الهدى، وهذا يبيّن أن الجدل المذموم هو من أعظم أسباب انحراف الأمم عن الحق الذي كانت عليه.</w:t>
+        <w:t xml:space="preserve">وقال النبي ﷺ: «مَا ضَلَّ قَوْمٌ بَعْدَ هُدًى كَانُوا عَلَيْهِ إِلَّا أُوتُوا الْجَدَلَ» ثم تلا قوله تعالى: </w:t>
+      </w:r>
+      <w:r>
+        <w:rPr>
+          <w:rFonts w:ascii="Amiri Quran" w:cs="Amiri Quran" w:eastAsia="Amiri Quran" w:hAnsi="Amiri Quran"/>
+          <w:b w:val="false"/>
+          <w:bCs w:val="false"/>
+          <w:i w:val="false"/>
+          <w:iCs w:val="false"/>
+          <w:color w:val="0D2143"/>
+          <w:sz w:val="26"/>
+          <w:szCs w:val="26"/>
+          <w:rtl/>
+        </w:rPr>
+        <w:t xml:space="preserve">﴿مَا ضَرَبُوهُ لَكَ إِلَّا جَدَلًا بَلْ هُمْ قَوْمٌ خَصِمُونَ﴾</w:t>
+      </w:r>
+      <w:r>
+        <w:rPr>
+          <w:rFonts w:ascii="Cairo" w:cs="Cairo" w:eastAsia="Cairo" w:hAnsi="Cairo"/>
+          <w:b/>
+          <w:bCs/>
+          <w:i w:val="false"/>
+          <w:iCs w:val="false"/>
+          <w:color w:val="8A6A1F"/>
+          <w:sz w:val="16"/>
+          <w:szCs w:val="16"/>
+          <w:rtl/>
+        </w:rPr>
+        <w:t xml:space="preserve"> [الزخرف: 58]</w:t>
+      </w:r>
+      <w:r>
+        <w:rPr>
+          <w:rFonts w:ascii="Amiri" w:cs="Amiri" w:eastAsia="Amiri" w:hAnsi="Amiri"/>
+          <w:b w:val="false"/>
+          <w:bCs w:val="false"/>
+          <w:i w:val="false"/>
+          <w:iCs w:val="false"/>
+          <w:color w:val="181410"/>
+          <w:sz w:val="22"/>
+          <w:szCs w:val="22"/>
+          <w:rtl/>
+        </w:rPr>
+        <w:t xml:space="preserve"> (رواه الترمذي)، فربط بين كثرة الجدل وبين الضلال بعد الهدى، وهذا يبيّن أن الجدل المذموم هو من أعظم أسباب انحراف الأمم عن الحق الذي كانت عليه.</w:t>
       </w:r>
     </w:p>
     <w:tbl>
@@ -8116,7 +8158,7 @@
           <w:szCs w:val="22"/>
           <w:rtl/>
         </w:rPr>
-        <w:t xml:space="preserve">حذّر أئمة السنة من القول باللفظ تحذيرًا شديدًا، ورأوا فيه بداية الانزلاق إلى القول بخلق القرآن من طريق غير مباشرة. قال الإمام أحمد بن حنبل رحمه الله: «من قال: لفظي بالقرآن مخلوق، فهو جهمي». وقال الإمام محمد بن إسماعيل البخاري رحمه الله: «من قال: لفظي بالقرآن مخلوق، فهو مبتدع». فهذان إمامان جليلان، أحدهما إمام أهل السنة في زمانه وأعلم الناس بمقالات الفرق، والآخر إمام أهل الحديث وصاحب الصحيح، اتفقا على تبديع هذا القول وتصنيف قائله في زمرة أهل البدع، مما يدل على خطورة هذه العبارة عند أئمة الاعتقاد، وعلى أنها ليست خلافًا لفظيًا هيّنًا كما قد يُظن.</w:t>
+        <w:t xml:space="preserve">حذّر أئمة السنة من القول باللفظ تحذيرًا شديدًا، ورأوا فيه بداية الانزلاق إلى القول بخلق القرآن من طريق غير مباشرة. قال الإمام أحمد بن حنبل رحمه الله في هذا القول بصيغته الجامعة المشهورة عنه: "من قال: القرآن مخلوق، فهو كافر؛ ومن قال: لفظي بالقرآن مخلوق، فهو جهمي؛ ومن قال: لفظي بالقرآن غير مخلوق، فهو مبتدع". وقد كانت مسألة "اللفظ" هذه سببًا في محنة وقعت لبعض أئمة الحديث أنفسهم، إذ اتُّهم الإمام محمد بن إسماعيل البخاري رحمه الله بالقول بها من قبل بعض معاصريه (كمحمد بن يحيى الذهلي)، فتبرأ منها البخاري رحمه الله، وهذا مما يدل على خطورة هذه العبارة عند أئمة الاعتقاد، وعلى أنها ليست خلافًا لفظيًا هيّنًا كما قد يُظن، حتى تجنّبها كبار الأئمة خشية الوقوع فيما لا يليق بمقام السنة.</w:t>
       </w:r>
     </w:p>
     <w:tbl>
@@ -21263,7 +21305,7 @@
           <w:szCs w:val="20"/>
           <w:rtl/>
         </w:rPr>
-        <w:t xml:space="preserve">فصول الأمة — شرح أصول السنة للإمام أحمد بن حنبل رضي الله عنهشرحٌ لأصول السنة بفقراتها الثمان والثلاثين، من مقدمتها إلى خاتمتها، بقلم راجي عفو ربه الغفور أحمد بن إبراهيم السليمي.جامعة الملك العالمية — Al-Mulk International University</w:t>
+        <w:t xml:space="preserve">فصول الأمة — شرح أصول السنة للإمام أحمد بن حنبل رحمه اللهشرحٌ لأصول السنة بفقراتها الثمان والثلاثين، من مقدمتها إلى خاتمتها، بقلم راجي عفو ربه الغفور أحمد بن إبراهيم السليمي.جامعة الملك العالمية — Al-Mulk International University</w:t>
       </w:r>
     </w:p>
     <w:p>

</xml_diff>

<commit_message>
Book 50: regenerate PDF/DOCX with fixed chapter-divider page breaks
</commit_message>
<xml_diff>
--- a/fusul-al-ummah/exports/فصول الأمة - شرح أصول السنة.docx
+++ b/fusul-al-ummah/exports/فصول الأمة - شرح أصول السنة.docx
@@ -18879,7 +18879,7 @@
           <w:szCs w:val="22"/>
           <w:rtl/>
         </w:rPr>
-        <w:t xml:space="preserve">استدل الإمام بقوله صلى الله عليه وسلم: «لَا تَسُبُّوا أَصْحَابِي، فَوَالَّذِي نَفْسِي بِيَدِهِ، لَوْ أَنَّ أَحَدَكُمْ أَنْفَقَ مِثْلَ أُحُدٍ ذَهَبًا مَا بَلَغَ مُدَّ أَحَدِهِمْ وَلَا نَصِيفَهُ» (رواه البخاري ومسلم)، ووجه الدلالة أن النبي ﷺ نهى صريحاً عن سب أصحابه، وبيّن أن فضلهم بصحبتهم إياه لا يبلغه أحد بعدهم مهما أنفق من المال، فكيف بمن يتعرض لأعراضهم بالطعن. واستدل أيضاً بشهادة علي بن أبي طالب رضي الله عنه نفسه، وهو أحد المعنيين مباشرة بالفتن التي وقعت، حين سُئل: من خير الناس بعد رسول الله صلى الله عليه وسلم؟ فقال: "أبو بكر"، قيل: ثم من؟ قال: "ثم عمر" (رواه البخاري)، فخشي ابنه محمد بن الحنفية أن يذكر عثمان فسأله: ثم أنت يا أبتِ؟ فقال: "ما أنا إلا رجل من المسلمين". وفي هذا دلالة بالغة على أن عليّاً نفسه -مع ما جرى بينه وبين بعض الصحابة من خلاف سياسي- لم يكن في قلبه شيء تجاه من سبقه، بل أقرّ بفضلهم صراحة، وتواضع عن تفضيل نفسه. ويؤيده حديث ابن عمر رضي الله عنهما: "كنا نقول والنبي صلى الله عليه وسلم حي: أفضل هذه الأمة بعد نبيها أبو بكر، ثم عمر، ثم عثمان" (رواه البخاري)، وهو الأصل في ترتيب الثلاثة، وقد سبق ذكره في الفقرة السادسة والعشرين.</w:t>
+        <w:t xml:space="preserve">استدل الإمام بقوله صلى الله عليه وسلم: «لَا تَسُبُّوا أَصْحَابِي، فَوَالَّذِي نَفْسِي بِيَدِهِ، لَوْ أَنَّ أَحَدَكُمْ أَنْفَقَ مِثْلَ أُحُدٍ ذَهَبًا مَا بَلَغَ مُدَّ أَحَدِهِمْ وَلَا نَصِيفَهُ» (رواه البخاري ومسلم، وقد سبق ذكره أيضاً في الفقرة الثامنة والعشرين)، ووجه الدلالة أن النبي ﷺ نهى صريحاً عن سب أصحابه، وبيّن أن فضلهم بصحبتهم إياه لا يبلغه أحد بعدهم مهما أنفق من المال، فكيف بمن يتعرض لأعراضهم بالطعن. واستدل أيضاً بشهادة علي بن أبي طالب رضي الله عنه نفسه، وقد سبق ذكرها في الفقرة السادسة والعشرين، وهو أحد المعنيين مباشرة بالفتن التي وقعت، حين سُئل: من خير الناس بعد رسول الله صلى الله عليه وسلم؟ فقال: "أبو بكر"، قيل: ثم من؟ قال: "ثم عمر" (رواه البخاري)، فخشي ابنه محمد بن الحنفية أن يذكر عثمان فسأله: ثم أنت يا أبتِ؟ فقال: "ما أنا إلا رجل من المسلمين". وفي هذا دلالة بالغة على أن عليّاً نفسه -مع ما جرى بينه وبين بعض الصحابة من خلاف سياسي- لم يكن في قلبه شيء تجاه من سبقه، بل أقرّ بفضلهم صراحة، وتواضع عن تفضيل نفسه. ويؤيده حديث ابن عمر رضي الله عنهما: "كنا نقول والنبي صلى الله عليه وسلم حي: أفضل هذه الأمة بعد نبيها أبو بكر، ثم عمر، ثم عثمان" (رواه البخاري)، وهو الأصل في ترتيب الثلاثة، وقد سبق ذكره في الفقرة السادسة والعشرين.</w:t>
       </w:r>
     </w:p>
     <w:p>
@@ -20299,7 +20299,7 @@
           <w:szCs w:val="22"/>
           <w:rtl/>
         </w:rPr>
-        <w:t xml:space="preserve"> أن "أصول السنة" رسالة موجزة اللفظ، عظيمة المعنى، جمع فيها الإمام أحمد رحمه الله خلاصة عقيدة أهل السنة والجماعة في الاتباع، والقدر، والقرآن، والصفات، واليوم الآخر، والصحابة، والإمامة، في أقل من أربعين فقرة، فكانت مثالاً على منهج السلف في الاختصار غير المخل، والتفصيل غير الممل.</w:t>
+        <w:t xml:space="preserve"> أن "أصول السنة" رسالة موجزة اللفظ، عظيمة المعنى، جمع فيها الإمام أحمد رحمه الله خلاصة عقيدة أهل السنة والجماعة في الاتباع، والقدر، والقرآن، والصفات، واليوم الآخر، وحقيقة الإيمان، والصحابة، والإمامة، والتوبة، ومنهج الحكم على الناس، في أقل من أربعين فقرة، فكانت مثالاً على منهج السلف في الاختصار غير المخل، والتفصيل غير الممل.</w:t>
       </w:r>
     </w:p>
     <w:p>

</xml_diff>